<commit_message>
feat(site): ampliar transparencia e trilhas cidada
</commit_message>
<xml_diff>
--- a/docs/pntp/solicitacoes-portal/Plano_Colaborativo_Melhorias_Portal_Transparencia_Camara_Varginha.docx
+++ b/docs/pntp/solicitacoes-portal/Plano_Colaborativo_Melhorias_Portal_Transparencia_Camara_Varginha.docx
@@ -44,7 +44,7 @@
           <w:color w:val="687581"/>
           <w:sz w:val="25"/>
         </w:rPr>
-        <w:t>Diagnóstico de falhas e plano de regularização integral em 60 dias</w:t>
+        <w:t>Diagnóstico de falhas e plano de regularização integral em 45 dias</w:t>
       </w:r>
     </w:p>
     <w:tbl>
@@ -150,7 +150,7 @@
                 <w:color w:val="17324D"/>
                 <w:sz w:val="18"/>
               </w:rPr>
-              <w:t>PROPONENTE</w:t>
+              <w:t>ORIGEM</w:t>
             </w:r>
           </w:p>
         </w:tc>
@@ -178,7 +178,7 @@
                 <w:color w:val="20262C"/>
                 <w:sz w:val="18"/>
               </w:rPr>
-              <w:t>Fiscaliza Varginha - iniciativa cidadã independente</w:t>
+              <w:t>Contribuição cidadã independente e apartidária</w:t>
             </w:r>
           </w:p>
         </w:tc>
@@ -302,7 +302,7 @@
                 <w:color w:val="20262C"/>
                 <w:sz w:val="18"/>
               </w:rPr>
-              <w:t>Resolver as pendências e concluir as melhorias aplicáveis em até 60 dias</w:t>
+              <w:t>Resolver as pendências e concluir as melhorias aplicáveis em até 45 dias</w:t>
             </w:r>
           </w:p>
         </w:tc>
@@ -356,7 +356,7 @@
                 <w:color w:val="20262C"/>
                 <w:sz w:val="20"/>
               </w:rPr>
-              <w:t>Este documento reconhece os avanços já existentes, aponta falhas e atrasos que precisam ser enfrentados e propõe uma agenda prática de cooperação para conclusão em 60 dias. Não presume irregularidade nem substitui a avaliação oficial do Tribunal de Contas.</w:t>
+              <w:t>Este documento reconhece os avanços já existentes, aponta falhas e atrasos que precisam ser enfrentados e propõe uma agenda prática de cooperação para conclusão em 45 dias. Não presume irregularidade nem substitui a avaliação oficial do Tribunal de Contas.</w:t>
             </w:r>
           </w:p>
         </w:tc>
@@ -366,6 +366,1208 @@
       <w:pPr>
         <w:spacing w:after="0" w:before="0"/>
       </w:pPr>
+    </w:p>
+    <w:p>
+      <w:r>
+        <w:br w:type="page"/>
+      </w:r>
+    </w:p>
+    <w:p>
+      <w:pPr>
+        <w:pStyle w:val="Heading1"/>
+      </w:pPr>
+      <w:r>
+        <w:t>Apresentação institucional</w:t>
+      </w:r>
+    </w:p>
+    <w:p>
+      <w:pPr>
+        <w:spacing w:after="160"/>
+      </w:pPr>
+      <w:r>
+        <w:rPr>
+          <w:rFonts w:ascii="Calibri" w:hAnsi="Calibri"/>
+          <w:b/>
+          <w:color w:val="17324D"/>
+          <w:sz w:val="36"/>
+        </w:rPr>
+        <w:t>Origem e autoridade da metodologia utilizada</w:t>
+      </w:r>
+    </w:p>
+    <w:p>
+      <w:pPr>
+        <w:keepLines/>
+        <w:widowControl/>
+        <w:jc w:val="both"/>
+      </w:pPr>
+      <w:r>
+        <w:rPr>
+          <w:rFonts w:ascii="Calibri" w:hAnsi="Calibri"/>
+          <w:color w:val="20262C"/>
+          <w:sz w:val="21"/>
+        </w:rPr>
+        <w:t>Os apontamentos deste plano não foram formulados a partir de preferências pessoais. A base principal é o Programa Nacional de Transparência Pública (PNTP), iniciativa coordenada pela Associação dos Membros dos Tribunais de Contas do Brasil (Atricon), com participação dos Tribunais de Contas na avaliação e validação dos portais públicos.</w:t>
+      </w:r>
+    </w:p>
+    <w:tbl>
+      <w:tblPr>
+        <w:tblW w:type="dxa" w:w="9638"/>
+        <w:jc w:val="left"/>
+        <w:tblLayout w:type="fixed"/>
+        <w:tblLook w:firstColumn="1" w:firstRow="1" w:lastColumn="0" w:lastRow="0" w:noHBand="0" w:noVBand="1" w:val="04A0"/>
+        <w:tblInd w:w="120" w:type="dxa"/>
+      </w:tblPr>
+      <w:tblGrid>
+        <w:gridCol w:w="9638"/>
+      </w:tblGrid>
+      <w:tr>
+        <w:trPr>
+          <w:cantSplit/>
+        </w:trPr>
+        <w:tc>
+          <w:tcPr>
+            <w:tcW w:type="dxa" w:w="9638"/>
+            <w:tcMar>
+              <w:top w:w="80" w:type="dxa"/>
+              <w:start w:w="120" w:type="dxa"/>
+              <w:bottom w:w="80" w:type="dxa"/>
+              <w:end w:w="120" w:type="dxa"/>
+            </w:tcMar>
+            <w:shd w:fill="F4F7FA"/>
+            <w:tcBorders>
+              <w:left w:val="single" w:sz="18" w:color="1F5D8F"/>
+            </w:tcBorders>
+          </w:tcPr>
+          <w:p>
+            <w:pPr>
+              <w:spacing w:after="0"/>
+            </w:pPr>
+            <w:r>
+              <w:rPr>
+                <w:rFonts w:ascii="Calibri" w:hAnsi="Calibri"/>
+                <w:b/>
+                <w:color w:val="17324D"/>
+                <w:sz w:val="20"/>
+              </w:rPr>
+              <w:t xml:space="preserve">Referência nacional. </w:t>
+            </w:r>
+            <w:r>
+              <w:rPr>
+                <w:rFonts w:ascii="Calibri" w:hAnsi="Calibri"/>
+                <w:color w:val="20262C"/>
+                <w:sz w:val="20"/>
+              </w:rPr>
+              <w:t>O PNTP examina a transparência ativa de portais dos Poderes Executivo, Legislativo e Judiciário e de outras instituições públicas. Os resultados são consolidados no Radar Nacional da Transparência Pública, que permite consultar índices, níveis de transparência e evidências relacionadas aos critérios avaliados.</w:t>
+            </w:r>
+          </w:p>
+        </w:tc>
+      </w:tr>
+    </w:tbl>
+    <w:p>
+      <w:pPr>
+        <w:spacing w:after="0" w:before="0"/>
+      </w:pPr>
+    </w:p>
+    <w:tbl>
+      <w:tblPr>
+        <w:tblW w:type="dxa" w:w="9638"/>
+        <w:jc w:val="left"/>
+        <w:tblLayout w:type="fixed"/>
+        <w:tblLook w:firstColumn="1" w:firstRow="1" w:lastColumn="0" w:lastRow="0" w:noHBand="0" w:noVBand="1" w:val="04A0"/>
+        <w:tblInd w:w="120" w:type="dxa"/>
+      </w:tblPr>
+      <w:tblGrid>
+        <w:gridCol w:w="1700"/>
+        <w:gridCol w:w="3650"/>
+        <w:gridCol w:w="4288"/>
+      </w:tblGrid>
+      <w:tr>
+        <w:trPr>
+          <w:tblHeader w:val="true"/>
+          <w:cantSplit/>
+        </w:trPr>
+        <w:tc>
+          <w:tcPr>
+            <w:tcW w:type="dxa" w:w="1700"/>
+            <w:tcMar>
+              <w:top w:w="80" w:type="dxa"/>
+              <w:start w:w="120" w:type="dxa"/>
+              <w:bottom w:w="80" w:type="dxa"/>
+              <w:end w:w="120" w:type="dxa"/>
+            </w:tcMar>
+            <w:shd w:fill="17324D"/>
+            <w:vAlign w:val="center"/>
+          </w:tcPr>
+          <w:p>
+            <w:pPr>
+              <w:spacing w:after="0"/>
+            </w:pPr>
+            <w:r>
+              <w:rPr>
+                <w:rFonts w:ascii="Calibri" w:hAnsi="Calibri"/>
+                <w:b/>
+                <w:color w:val="FFFFFF"/>
+                <w:sz w:val="17"/>
+              </w:rPr>
+              <w:t>ELEMENTO</w:t>
+            </w:r>
+          </w:p>
+        </w:tc>
+        <w:tc>
+          <w:tcPr>
+            <w:tcW w:type="dxa" w:w="3650"/>
+            <w:tcMar>
+              <w:top w:w="80" w:type="dxa"/>
+              <w:start w:w="120" w:type="dxa"/>
+              <w:bottom w:w="80" w:type="dxa"/>
+              <w:end w:w="120" w:type="dxa"/>
+            </w:tcMar>
+            <w:shd w:fill="17324D"/>
+            <w:vAlign w:val="center"/>
+          </w:tcPr>
+          <w:p>
+            <w:pPr>
+              <w:spacing w:after="0"/>
+            </w:pPr>
+            <w:r>
+              <w:rPr>
+                <w:rFonts w:ascii="Calibri" w:hAnsi="Calibri"/>
+                <w:b/>
+                <w:color w:val="FFFFFF"/>
+                <w:sz w:val="17"/>
+              </w:rPr>
+              <w:t>ORIGEM INSTITUCIONAL</w:t>
+            </w:r>
+          </w:p>
+        </w:tc>
+        <w:tc>
+          <w:tcPr>
+            <w:tcW w:type="dxa" w:w="4288"/>
+            <w:tcMar>
+              <w:top w:w="80" w:type="dxa"/>
+              <w:start w:w="120" w:type="dxa"/>
+              <w:bottom w:w="80" w:type="dxa"/>
+              <w:end w:w="120" w:type="dxa"/>
+            </w:tcMar>
+            <w:shd w:fill="17324D"/>
+            <w:vAlign w:val="center"/>
+          </w:tcPr>
+          <w:p>
+            <w:pPr>
+              <w:spacing w:after="0"/>
+            </w:pPr>
+            <w:r>
+              <w:rPr>
+                <w:rFonts w:ascii="Calibri" w:hAnsi="Calibri"/>
+                <w:b/>
+                <w:color w:val="FFFFFF"/>
+                <w:sz w:val="17"/>
+              </w:rPr>
+              <w:t>FUNÇÃO</w:t>
+            </w:r>
+          </w:p>
+        </w:tc>
+      </w:tr>
+      <w:tr>
+        <w:trPr>
+          <w:cantSplit/>
+        </w:trPr>
+        <w:tc>
+          <w:tcPr>
+            <w:tcW w:type="dxa" w:w="1700"/>
+            <w:vAlign w:val="top"/>
+            <w:tcBorders>
+              <w:bottom w:val="single" w:sz="3" w:color="D8DEE3"/>
+            </w:tcBorders>
+          </w:tcPr>
+          <w:p>
+            <w:pPr>
+              <w:spacing w:after="0" w:line="240" w:lineRule="auto"/>
+            </w:pPr>
+            <w:r>
+              <w:rPr>
+                <w:rFonts w:ascii="Calibri" w:hAnsi="Calibri"/>
+                <w:b/>
+                <w:color w:val="1F5D8F"/>
+                <w:sz w:val="17"/>
+              </w:rPr>
+              <w:t>Coordenação</w:t>
+            </w:r>
+          </w:p>
+        </w:tc>
+        <w:tc>
+          <w:tcPr>
+            <w:tcW w:type="dxa" w:w="3650"/>
+            <w:vAlign w:val="top"/>
+            <w:tcBorders>
+              <w:bottom w:val="single" w:sz="3" w:color="D8DEE3"/>
+            </w:tcBorders>
+          </w:tcPr>
+          <w:p>
+            <w:pPr>
+              <w:spacing w:after="0" w:line="240" w:lineRule="auto"/>
+            </w:pPr>
+            <w:r>
+              <w:rPr>
+                <w:rFonts w:ascii="Calibri" w:hAnsi="Calibri"/>
+                <w:b w:val="0"/>
+                <w:color w:val="20262C"/>
+                <w:sz w:val="17"/>
+              </w:rPr>
+              <w:t>Atricon e instituições parceiras do sistema de controle externo.</w:t>
+            </w:r>
+          </w:p>
+        </w:tc>
+        <w:tc>
+          <w:tcPr>
+            <w:tcW w:type="dxa" w:w="4288"/>
+            <w:vAlign w:val="top"/>
+            <w:tcBorders>
+              <w:bottom w:val="single" w:sz="3" w:color="D8DEE3"/>
+            </w:tcBorders>
+          </w:tcPr>
+          <w:p>
+            <w:pPr>
+              <w:spacing w:after="0" w:line="240" w:lineRule="auto"/>
+            </w:pPr>
+            <w:r>
+              <w:rPr>
+                <w:rFonts w:ascii="Calibri" w:hAnsi="Calibri"/>
+                <w:b w:val="0"/>
+                <w:color w:val="20262C"/>
+                <w:sz w:val="17"/>
+              </w:rPr>
+              <w:t>Define diretrizes nacionais, metodologia, cartilha e matriz de avaliação.</w:t>
+            </w:r>
+          </w:p>
+        </w:tc>
+      </w:tr>
+      <w:tr>
+        <w:trPr>
+          <w:cantSplit/>
+        </w:trPr>
+        <w:tc>
+          <w:tcPr>
+            <w:tcW w:type="dxa" w:w="1700"/>
+            <w:vAlign w:val="top"/>
+            <w:shd w:fill="F2F4F7"/>
+            <w:tcBorders>
+              <w:bottom w:val="single" w:sz="3" w:color="D8DEE3"/>
+            </w:tcBorders>
+          </w:tcPr>
+          <w:p>
+            <w:pPr>
+              <w:spacing w:after="0" w:line="240" w:lineRule="auto"/>
+            </w:pPr>
+            <w:r>
+              <w:rPr>
+                <w:rFonts w:ascii="Calibri" w:hAnsi="Calibri"/>
+                <w:b/>
+                <w:color w:val="1F5D8F"/>
+                <w:sz w:val="17"/>
+              </w:rPr>
+              <w:t>Instrumento oficial</w:t>
+            </w:r>
+          </w:p>
+        </w:tc>
+        <w:tc>
+          <w:tcPr>
+            <w:tcW w:type="dxa" w:w="3650"/>
+            <w:vAlign w:val="top"/>
+            <w:shd w:fill="F2F4F7"/>
+            <w:tcBorders>
+              <w:bottom w:val="single" w:sz="3" w:color="D8DEE3"/>
+            </w:tcBorders>
+          </w:tcPr>
+          <w:p>
+            <w:pPr>
+              <w:spacing w:after="0" w:line="240" w:lineRule="auto"/>
+            </w:pPr>
+            <w:r>
+              <w:rPr>
+                <w:rFonts w:ascii="Calibri" w:hAnsi="Calibri"/>
+                <w:b w:val="0"/>
+                <w:color w:val="20262C"/>
+                <w:sz w:val="17"/>
+              </w:rPr>
+              <w:t>Cartilha PNTP e Critérios de Avaliação 2026 publicados no Radar.</w:t>
+            </w:r>
+          </w:p>
+        </w:tc>
+        <w:tc>
+          <w:tcPr>
+            <w:tcW w:type="dxa" w:w="4288"/>
+            <w:vAlign w:val="top"/>
+            <w:shd w:fill="F2F4F7"/>
+            <w:tcBorders>
+              <w:bottom w:val="single" w:sz="3" w:color="D8DEE3"/>
+            </w:tcBorders>
+          </w:tcPr>
+          <w:p>
+            <w:pPr>
+              <w:spacing w:after="0" w:line="240" w:lineRule="auto"/>
+            </w:pPr>
+            <w:r>
+              <w:rPr>
+                <w:rFonts w:ascii="Calibri" w:hAnsi="Calibri"/>
+                <w:b w:val="0"/>
+                <w:color w:val="20262C"/>
+                <w:sz w:val="17"/>
+              </w:rPr>
+              <w:t>Fornece a redação, classificação e aplicabilidade dos critérios.</w:t>
+            </w:r>
+          </w:p>
+        </w:tc>
+      </w:tr>
+      <w:tr>
+        <w:trPr>
+          <w:cantSplit/>
+        </w:trPr>
+        <w:tc>
+          <w:tcPr>
+            <w:tcW w:type="dxa" w:w="1700"/>
+            <w:vAlign w:val="top"/>
+            <w:tcBorders>
+              <w:bottom w:val="single" w:sz="3" w:color="D8DEE3"/>
+            </w:tcBorders>
+          </w:tcPr>
+          <w:p>
+            <w:pPr>
+              <w:spacing w:after="0" w:line="240" w:lineRule="auto"/>
+            </w:pPr>
+            <w:r>
+              <w:rPr>
+                <w:rFonts w:ascii="Calibri" w:hAnsi="Calibri"/>
+                <w:b/>
+                <w:color w:val="1F5D8F"/>
+                <w:sz w:val="17"/>
+              </w:rPr>
+              <w:t>Avaliação</w:t>
+            </w:r>
+          </w:p>
+        </w:tc>
+        <w:tc>
+          <w:tcPr>
+            <w:tcW w:type="dxa" w:w="3650"/>
+            <w:vAlign w:val="top"/>
+            <w:tcBorders>
+              <w:bottom w:val="single" w:sz="3" w:color="D8DEE3"/>
+            </w:tcBorders>
+          </w:tcPr>
+          <w:p>
+            <w:pPr>
+              <w:spacing w:after="0" w:line="240" w:lineRule="auto"/>
+            </w:pPr>
+            <w:r>
+              <w:rPr>
+                <w:rFonts w:ascii="Calibri" w:hAnsi="Calibri"/>
+                <w:b w:val="0"/>
+                <w:color w:val="20262C"/>
+                <w:sz w:val="17"/>
+              </w:rPr>
+              <w:t>Controladorias e equipes técnicas dos Tribunais de Contas.</w:t>
+            </w:r>
+          </w:p>
+        </w:tc>
+        <w:tc>
+          <w:tcPr>
+            <w:tcW w:type="dxa" w:w="4288"/>
+            <w:vAlign w:val="top"/>
+            <w:tcBorders>
+              <w:bottom w:val="single" w:sz="3" w:color="D8DEE3"/>
+            </w:tcBorders>
+          </w:tcPr>
+          <w:p>
+            <w:pPr>
+              <w:spacing w:after="0" w:line="240" w:lineRule="auto"/>
+            </w:pPr>
+            <w:r>
+              <w:rPr>
+                <w:rFonts w:ascii="Calibri" w:hAnsi="Calibri"/>
+                <w:b w:val="0"/>
+                <w:color w:val="20262C"/>
+                <w:sz w:val="17"/>
+              </w:rPr>
+              <w:t>Verificam atendimento, evidências e qualidade da transparência ativa.</w:t>
+            </w:r>
+          </w:p>
+        </w:tc>
+      </w:tr>
+      <w:tr>
+        <w:trPr>
+          <w:cantSplit/>
+        </w:trPr>
+        <w:tc>
+          <w:tcPr>
+            <w:tcW w:type="dxa" w:w="1700"/>
+            <w:vAlign w:val="top"/>
+            <w:shd w:fill="F2F4F7"/>
+            <w:tcBorders>
+              <w:bottom w:val="single" w:sz="3" w:color="D8DEE3"/>
+            </w:tcBorders>
+          </w:tcPr>
+          <w:p>
+            <w:pPr>
+              <w:spacing w:after="0" w:line="240" w:lineRule="auto"/>
+            </w:pPr>
+            <w:r>
+              <w:rPr>
+                <w:rFonts w:ascii="Calibri" w:hAnsi="Calibri"/>
+                <w:b/>
+                <w:color w:val="1F5D8F"/>
+                <w:sz w:val="17"/>
+              </w:rPr>
+              <w:t>Resultado público</w:t>
+            </w:r>
+          </w:p>
+        </w:tc>
+        <w:tc>
+          <w:tcPr>
+            <w:tcW w:type="dxa" w:w="3650"/>
+            <w:vAlign w:val="top"/>
+            <w:shd w:fill="F2F4F7"/>
+            <w:tcBorders>
+              <w:bottom w:val="single" w:sz="3" w:color="D8DEE3"/>
+            </w:tcBorders>
+          </w:tcPr>
+          <w:p>
+            <w:pPr>
+              <w:spacing w:after="0" w:line="240" w:lineRule="auto"/>
+            </w:pPr>
+            <w:r>
+              <w:rPr>
+                <w:rFonts w:ascii="Calibri" w:hAnsi="Calibri"/>
+                <w:b w:val="0"/>
+                <w:color w:val="20262C"/>
+                <w:sz w:val="17"/>
+              </w:rPr>
+              <w:t>Radar Nacional da Transparência Pública.</w:t>
+            </w:r>
+          </w:p>
+        </w:tc>
+        <w:tc>
+          <w:tcPr>
+            <w:tcW w:type="dxa" w:w="4288"/>
+            <w:vAlign w:val="top"/>
+            <w:shd w:fill="F2F4F7"/>
+            <w:tcBorders>
+              <w:bottom w:val="single" w:sz="3" w:color="D8DEE3"/>
+            </w:tcBorders>
+          </w:tcPr>
+          <w:p>
+            <w:pPr>
+              <w:spacing w:after="0" w:line="240" w:lineRule="auto"/>
+            </w:pPr>
+            <w:r>
+              <w:rPr>
+                <w:rFonts w:ascii="Calibri" w:hAnsi="Calibri"/>
+                <w:b w:val="0"/>
+                <w:color w:val="20262C"/>
+                <w:sz w:val="17"/>
+              </w:rPr>
+              <w:t>Consolida o índice e os níveis Diamante, Ouro, Prata, Elevado e demais faixas.</w:t>
+            </w:r>
+          </w:p>
+        </w:tc>
+      </w:tr>
+      <w:tr>
+        <w:trPr>
+          <w:cantSplit/>
+        </w:trPr>
+        <w:tc>
+          <w:tcPr>
+            <w:tcW w:type="dxa" w:w="1700"/>
+            <w:vAlign w:val="top"/>
+            <w:tcBorders>
+              <w:bottom w:val="single" w:sz="3" w:color="D8DEE3"/>
+            </w:tcBorders>
+          </w:tcPr>
+          <w:p>
+            <w:pPr>
+              <w:spacing w:after="0" w:line="240" w:lineRule="auto"/>
+            </w:pPr>
+            <w:r>
+              <w:rPr>
+                <w:rFonts w:ascii="Calibri" w:hAnsi="Calibri"/>
+                <w:b/>
+                <w:color w:val="1F5D8F"/>
+                <w:sz w:val="17"/>
+              </w:rPr>
+              <w:t>Aplicação local</w:t>
+            </w:r>
+          </w:p>
+        </w:tc>
+        <w:tc>
+          <w:tcPr>
+            <w:tcW w:type="dxa" w:w="3650"/>
+            <w:vAlign w:val="top"/>
+            <w:tcBorders>
+              <w:bottom w:val="single" w:sz="3" w:color="D8DEE3"/>
+            </w:tcBorders>
+          </w:tcPr>
+          <w:p>
+            <w:pPr>
+              <w:spacing w:after="0" w:line="240" w:lineRule="auto"/>
+            </w:pPr>
+            <w:r>
+              <w:rPr>
+                <w:rFonts w:ascii="Calibri" w:hAnsi="Calibri"/>
+                <w:b w:val="0"/>
+                <w:color w:val="20262C"/>
+                <w:sz w:val="17"/>
+              </w:rPr>
+              <w:t>TCE-MG no ciclo mineiro do PNTP.</w:t>
+            </w:r>
+          </w:p>
+        </w:tc>
+        <w:tc>
+          <w:tcPr>
+            <w:tcW w:type="dxa" w:w="4288"/>
+            <w:vAlign w:val="top"/>
+            <w:tcBorders>
+              <w:bottom w:val="single" w:sz="3" w:color="D8DEE3"/>
+            </w:tcBorders>
+          </w:tcPr>
+          <w:p>
+            <w:pPr>
+              <w:spacing w:after="0" w:line="240" w:lineRule="auto"/>
+            </w:pPr>
+            <w:r>
+              <w:rPr>
+                <w:rFonts w:ascii="Calibri" w:hAnsi="Calibri"/>
+                <w:b w:val="0"/>
+                <w:color w:val="20262C"/>
+                <w:sz w:val="17"/>
+              </w:rPr>
+              <w:t>Orienta e valida avaliações dos portais municipais de Minas Gerais.</w:t>
+            </w:r>
+          </w:p>
+        </w:tc>
+      </w:tr>
+    </w:tbl>
+    <w:p>
+      <w:pPr>
+        <w:pStyle w:val="Heading2"/>
+      </w:pPr>
+      <w:r>
+        <w:t>Como a matriz foi aplicada à Câmara</w:t>
+      </w:r>
+    </w:p>
+    <w:p>
+      <w:pPr>
+        <w:keepLines/>
+        <w:widowControl/>
+        <w:jc w:val="both"/>
+      </w:pPr>
+      <w:r>
+        <w:rPr>
+          <w:rFonts w:ascii="Calibri" w:hAnsi="Calibri"/>
+          <w:color w:val="20262C"/>
+          <w:sz w:val="21"/>
+        </w:rPr>
+        <w:t>A Matriz PNTP 2026 foi filtrada pelas categorias aplicáveis ao Poder Legislativo municipal. Desse procedimento resultaram os 83 critérios reunidos no Anexo A: 7 essenciais, 60 obrigatórios e 16 recomendados. Cada critério foi convertido em uma ação de melhoria e em uma evidência de entrega, preservando a redação oficial na coluna correspondente.</w:t>
+      </w:r>
+    </w:p>
+    <w:tbl>
+      <w:tblPr>
+        <w:tblW w:type="dxa" w:w="9638"/>
+        <w:jc w:val="left"/>
+        <w:tblLayout w:type="fixed"/>
+        <w:tblLook w:firstColumn="1" w:firstRow="1" w:lastColumn="0" w:lastRow="0" w:noHBand="0" w:noVBand="1" w:val="04A0"/>
+        <w:tblInd w:w="120" w:type="dxa"/>
+      </w:tblPr>
+      <w:tblGrid>
+        <w:gridCol w:w="1900"/>
+        <w:gridCol w:w="2300"/>
+        <w:gridCol w:w="5438"/>
+      </w:tblGrid>
+      <w:tr>
+        <w:trPr>
+          <w:tblHeader w:val="true"/>
+          <w:cantSplit/>
+        </w:trPr>
+        <w:tc>
+          <w:tcPr>
+            <w:tcW w:type="dxa" w:w="1900"/>
+            <w:tcMar>
+              <w:top w:w="80" w:type="dxa"/>
+              <w:start w:w="120" w:type="dxa"/>
+              <w:bottom w:w="80" w:type="dxa"/>
+              <w:end w:w="120" w:type="dxa"/>
+            </w:tcMar>
+            <w:shd w:fill="17324D"/>
+            <w:vAlign w:val="center"/>
+          </w:tcPr>
+          <w:p>
+            <w:pPr>
+              <w:spacing w:after="0"/>
+            </w:pPr>
+            <w:r>
+              <w:rPr>
+                <w:rFonts w:ascii="Calibri" w:hAnsi="Calibri"/>
+                <w:b/>
+                <w:color w:val="FFFFFF"/>
+                <w:sz w:val="17"/>
+              </w:rPr>
+              <w:t>NÍVEL</w:t>
+            </w:r>
+          </w:p>
+        </w:tc>
+        <w:tc>
+          <w:tcPr>
+            <w:tcW w:type="dxa" w:w="2300"/>
+            <w:tcMar>
+              <w:top w:w="80" w:type="dxa"/>
+              <w:start w:w="120" w:type="dxa"/>
+              <w:bottom w:w="80" w:type="dxa"/>
+              <w:end w:w="120" w:type="dxa"/>
+            </w:tcMar>
+            <w:shd w:fill="17324D"/>
+            <w:vAlign w:val="center"/>
+          </w:tcPr>
+          <w:p>
+            <w:pPr>
+              <w:spacing w:after="0"/>
+            </w:pPr>
+            <w:r>
+              <w:rPr>
+                <w:rFonts w:ascii="Calibri" w:hAnsi="Calibri"/>
+                <w:b/>
+                <w:color w:val="FFFFFF"/>
+                <w:sz w:val="17"/>
+              </w:rPr>
+              <w:t>ÍNDICE</w:t>
+            </w:r>
+          </w:p>
+        </w:tc>
+        <w:tc>
+          <w:tcPr>
+            <w:tcW w:type="dxa" w:w="5438"/>
+            <w:tcMar>
+              <w:top w:w="80" w:type="dxa"/>
+              <w:start w:w="120" w:type="dxa"/>
+              <w:bottom w:w="80" w:type="dxa"/>
+              <w:end w:w="120" w:type="dxa"/>
+            </w:tcMar>
+            <w:shd w:fill="17324D"/>
+            <w:vAlign w:val="center"/>
+          </w:tcPr>
+          <w:p>
+            <w:pPr>
+              <w:spacing w:after="0"/>
+            </w:pPr>
+            <w:r>
+              <w:rPr>
+                <w:rFonts w:ascii="Calibri" w:hAnsi="Calibri"/>
+                <w:b/>
+                <w:color w:val="FFFFFF"/>
+                <w:sz w:val="17"/>
+              </w:rPr>
+              <w:t>REQUISITO COMPLEMENTAR</w:t>
+            </w:r>
+          </w:p>
+        </w:tc>
+      </w:tr>
+      <w:tr>
+        <w:trPr>
+          <w:cantSplit/>
+        </w:trPr>
+        <w:tc>
+          <w:tcPr>
+            <w:tcW w:type="dxa" w:w="1900"/>
+            <w:vAlign w:val="top"/>
+            <w:tcBorders>
+              <w:bottom w:val="single" w:sz="3" w:color="D8DEE3"/>
+            </w:tcBorders>
+          </w:tcPr>
+          <w:p>
+            <w:pPr>
+              <w:spacing w:after="0" w:line="240" w:lineRule="auto"/>
+            </w:pPr>
+            <w:r>
+              <w:rPr>
+                <w:rFonts w:ascii="Calibri" w:hAnsi="Calibri"/>
+                <w:b/>
+                <w:color w:val="1F5D8F"/>
+                <w:sz w:val="17"/>
+              </w:rPr>
+              <w:t>Diamante</w:t>
+            </w:r>
+          </w:p>
+        </w:tc>
+        <w:tc>
+          <w:tcPr>
+            <w:tcW w:type="dxa" w:w="2300"/>
+            <w:vAlign w:val="top"/>
+            <w:tcBorders>
+              <w:bottom w:val="single" w:sz="3" w:color="D8DEE3"/>
+            </w:tcBorders>
+          </w:tcPr>
+          <w:p>
+            <w:pPr>
+              <w:spacing w:after="0" w:line="240" w:lineRule="auto"/>
+            </w:pPr>
+            <w:r>
+              <w:rPr>
+                <w:rFonts w:ascii="Calibri" w:hAnsi="Calibri"/>
+                <w:b w:val="0"/>
+                <w:color w:val="20262C"/>
+                <w:sz w:val="17"/>
+              </w:rPr>
+              <w:t>95% a 100%</w:t>
+            </w:r>
+          </w:p>
+        </w:tc>
+        <w:tc>
+          <w:tcPr>
+            <w:tcW w:type="dxa" w:w="5438"/>
+            <w:vAlign w:val="top"/>
+            <w:tcBorders>
+              <w:bottom w:val="single" w:sz="3" w:color="D8DEE3"/>
+            </w:tcBorders>
+          </w:tcPr>
+          <w:p>
+            <w:pPr>
+              <w:spacing w:after="0" w:line="240" w:lineRule="auto"/>
+            </w:pPr>
+            <w:r>
+              <w:rPr>
+                <w:rFonts w:ascii="Calibri" w:hAnsi="Calibri"/>
+                <w:b w:val="0"/>
+                <w:color w:val="20262C"/>
+                <w:sz w:val="17"/>
+              </w:rPr>
+              <w:t>100% dos critérios essenciais</w:t>
+            </w:r>
+          </w:p>
+        </w:tc>
+      </w:tr>
+      <w:tr>
+        <w:trPr>
+          <w:cantSplit/>
+        </w:trPr>
+        <w:tc>
+          <w:tcPr>
+            <w:tcW w:type="dxa" w:w="1900"/>
+            <w:vAlign w:val="top"/>
+            <w:shd w:fill="F2F4F7"/>
+            <w:tcBorders>
+              <w:bottom w:val="single" w:sz="3" w:color="D8DEE3"/>
+            </w:tcBorders>
+          </w:tcPr>
+          <w:p>
+            <w:pPr>
+              <w:spacing w:after="0" w:line="240" w:lineRule="auto"/>
+            </w:pPr>
+            <w:r>
+              <w:rPr>
+                <w:rFonts w:ascii="Calibri" w:hAnsi="Calibri"/>
+                <w:b/>
+                <w:color w:val="1F5D8F"/>
+                <w:sz w:val="17"/>
+              </w:rPr>
+              <w:t>Ouro</w:t>
+            </w:r>
+          </w:p>
+        </w:tc>
+        <w:tc>
+          <w:tcPr>
+            <w:tcW w:type="dxa" w:w="2300"/>
+            <w:vAlign w:val="top"/>
+            <w:shd w:fill="F2F4F7"/>
+            <w:tcBorders>
+              <w:bottom w:val="single" w:sz="3" w:color="D8DEE3"/>
+            </w:tcBorders>
+          </w:tcPr>
+          <w:p>
+            <w:pPr>
+              <w:spacing w:after="0" w:line="240" w:lineRule="auto"/>
+            </w:pPr>
+            <w:r>
+              <w:rPr>
+                <w:rFonts w:ascii="Calibri" w:hAnsi="Calibri"/>
+                <w:b w:val="0"/>
+                <w:color w:val="20262C"/>
+                <w:sz w:val="17"/>
+              </w:rPr>
+              <w:t>85% a 94%</w:t>
+            </w:r>
+          </w:p>
+        </w:tc>
+        <w:tc>
+          <w:tcPr>
+            <w:tcW w:type="dxa" w:w="5438"/>
+            <w:vAlign w:val="top"/>
+            <w:shd w:fill="F2F4F7"/>
+            <w:tcBorders>
+              <w:bottom w:val="single" w:sz="3" w:color="D8DEE3"/>
+            </w:tcBorders>
+          </w:tcPr>
+          <w:p>
+            <w:pPr>
+              <w:spacing w:after="0" w:line="240" w:lineRule="auto"/>
+            </w:pPr>
+            <w:r>
+              <w:rPr>
+                <w:rFonts w:ascii="Calibri" w:hAnsi="Calibri"/>
+                <w:b w:val="0"/>
+                <w:color w:val="20262C"/>
+                <w:sz w:val="17"/>
+              </w:rPr>
+              <w:t>100% dos critérios essenciais</w:t>
+            </w:r>
+          </w:p>
+        </w:tc>
+      </w:tr>
+      <w:tr>
+        <w:trPr>
+          <w:cantSplit/>
+        </w:trPr>
+        <w:tc>
+          <w:tcPr>
+            <w:tcW w:type="dxa" w:w="1900"/>
+            <w:vAlign w:val="top"/>
+            <w:tcBorders>
+              <w:bottom w:val="single" w:sz="3" w:color="D8DEE3"/>
+            </w:tcBorders>
+          </w:tcPr>
+          <w:p>
+            <w:pPr>
+              <w:spacing w:after="0" w:line="240" w:lineRule="auto"/>
+            </w:pPr>
+            <w:r>
+              <w:rPr>
+                <w:rFonts w:ascii="Calibri" w:hAnsi="Calibri"/>
+                <w:b/>
+                <w:color w:val="1F5D8F"/>
+                <w:sz w:val="17"/>
+              </w:rPr>
+              <w:t>Prata</w:t>
+            </w:r>
+          </w:p>
+        </w:tc>
+        <w:tc>
+          <w:tcPr>
+            <w:tcW w:type="dxa" w:w="2300"/>
+            <w:vAlign w:val="top"/>
+            <w:tcBorders>
+              <w:bottom w:val="single" w:sz="3" w:color="D8DEE3"/>
+            </w:tcBorders>
+          </w:tcPr>
+          <w:p>
+            <w:pPr>
+              <w:spacing w:after="0" w:line="240" w:lineRule="auto"/>
+            </w:pPr>
+            <w:r>
+              <w:rPr>
+                <w:rFonts w:ascii="Calibri" w:hAnsi="Calibri"/>
+                <w:b w:val="0"/>
+                <w:color w:val="20262C"/>
+                <w:sz w:val="17"/>
+              </w:rPr>
+              <w:t>75% a 84%</w:t>
+            </w:r>
+          </w:p>
+        </w:tc>
+        <w:tc>
+          <w:tcPr>
+            <w:tcW w:type="dxa" w:w="5438"/>
+            <w:vAlign w:val="top"/>
+            <w:tcBorders>
+              <w:bottom w:val="single" w:sz="3" w:color="D8DEE3"/>
+            </w:tcBorders>
+          </w:tcPr>
+          <w:p>
+            <w:pPr>
+              <w:spacing w:after="0" w:line="240" w:lineRule="auto"/>
+            </w:pPr>
+            <w:r>
+              <w:rPr>
+                <w:rFonts w:ascii="Calibri" w:hAnsi="Calibri"/>
+                <w:b w:val="0"/>
+                <w:color w:val="20262C"/>
+                <w:sz w:val="17"/>
+              </w:rPr>
+              <w:t>100% dos critérios essenciais</w:t>
+            </w:r>
+          </w:p>
+        </w:tc>
+      </w:tr>
+      <w:tr>
+        <w:trPr>
+          <w:cantSplit/>
+        </w:trPr>
+        <w:tc>
+          <w:tcPr>
+            <w:tcW w:type="dxa" w:w="1900"/>
+            <w:vAlign w:val="top"/>
+            <w:shd w:fill="F2F4F7"/>
+            <w:tcBorders>
+              <w:bottom w:val="single" w:sz="3" w:color="D8DEE3"/>
+            </w:tcBorders>
+          </w:tcPr>
+          <w:p>
+            <w:pPr>
+              <w:spacing w:after="0" w:line="240" w:lineRule="auto"/>
+            </w:pPr>
+            <w:r>
+              <w:rPr>
+                <w:rFonts w:ascii="Calibri" w:hAnsi="Calibri"/>
+                <w:b/>
+                <w:color w:val="1F5D8F"/>
+                <w:sz w:val="17"/>
+              </w:rPr>
+              <w:t>Elevado</w:t>
+            </w:r>
+          </w:p>
+        </w:tc>
+        <w:tc>
+          <w:tcPr>
+            <w:tcW w:type="dxa" w:w="2300"/>
+            <w:vAlign w:val="top"/>
+            <w:shd w:fill="F2F4F7"/>
+            <w:tcBorders>
+              <w:bottom w:val="single" w:sz="3" w:color="D8DEE3"/>
+            </w:tcBorders>
+          </w:tcPr>
+          <w:p>
+            <w:pPr>
+              <w:spacing w:after="0" w:line="240" w:lineRule="auto"/>
+            </w:pPr>
+            <w:r>
+              <w:rPr>
+                <w:rFonts w:ascii="Calibri" w:hAnsi="Calibri"/>
+                <w:b w:val="0"/>
+                <w:color w:val="20262C"/>
+                <w:sz w:val="17"/>
+              </w:rPr>
+              <w:t>Acima de 75%</w:t>
+            </w:r>
+          </w:p>
+        </w:tc>
+        <w:tc>
+          <w:tcPr>
+            <w:tcW w:type="dxa" w:w="5438"/>
+            <w:vAlign w:val="top"/>
+            <w:shd w:fill="F2F4F7"/>
+            <w:tcBorders>
+              <w:bottom w:val="single" w:sz="3" w:color="D8DEE3"/>
+            </w:tcBorders>
+          </w:tcPr>
+          <w:p>
+            <w:pPr>
+              <w:spacing w:after="0" w:line="240" w:lineRule="auto"/>
+            </w:pPr>
+            <w:r>
+              <w:rPr>
+                <w:rFonts w:ascii="Calibri" w:hAnsi="Calibri"/>
+                <w:b w:val="0"/>
+                <w:color w:val="20262C"/>
+                <w:sz w:val="17"/>
+              </w:rPr>
+              <w:t>Menos de 100% dos critérios essenciais</w:t>
+            </w:r>
+          </w:p>
+        </w:tc>
+      </w:tr>
+      <w:tr>
+        <w:trPr>
+          <w:cantSplit/>
+        </w:trPr>
+        <w:tc>
+          <w:tcPr>
+            <w:tcW w:type="dxa" w:w="1900"/>
+            <w:vAlign w:val="top"/>
+            <w:tcBorders>
+              <w:bottom w:val="single" w:sz="3" w:color="D8DEE3"/>
+            </w:tcBorders>
+          </w:tcPr>
+          <w:p>
+            <w:pPr>
+              <w:spacing w:after="0" w:line="240" w:lineRule="auto"/>
+            </w:pPr>
+            <w:r>
+              <w:rPr>
+                <w:rFonts w:ascii="Calibri" w:hAnsi="Calibri"/>
+                <w:b/>
+                <w:color w:val="1F5D8F"/>
+                <w:sz w:val="17"/>
+              </w:rPr>
+              <w:t>Intermediário</w:t>
+            </w:r>
+          </w:p>
+        </w:tc>
+        <w:tc>
+          <w:tcPr>
+            <w:tcW w:type="dxa" w:w="2300"/>
+            <w:vAlign w:val="top"/>
+            <w:tcBorders>
+              <w:bottom w:val="single" w:sz="3" w:color="D8DEE3"/>
+            </w:tcBorders>
+          </w:tcPr>
+          <w:p>
+            <w:pPr>
+              <w:spacing w:after="0" w:line="240" w:lineRule="auto"/>
+            </w:pPr>
+            <w:r>
+              <w:rPr>
+                <w:rFonts w:ascii="Calibri" w:hAnsi="Calibri"/>
+                <w:b w:val="0"/>
+                <w:color w:val="20262C"/>
+                <w:sz w:val="17"/>
+              </w:rPr>
+              <w:t>50% a 74%</w:t>
+            </w:r>
+          </w:p>
+        </w:tc>
+        <w:tc>
+          <w:tcPr>
+            <w:tcW w:type="dxa" w:w="5438"/>
+            <w:vAlign w:val="top"/>
+            <w:tcBorders>
+              <w:bottom w:val="single" w:sz="3" w:color="D8DEE3"/>
+            </w:tcBorders>
+          </w:tcPr>
+          <w:p>
+            <w:pPr>
+              <w:spacing w:after="0" w:line="240" w:lineRule="auto"/>
+            </w:pPr>
+            <w:r>
+              <w:rPr>
+                <w:rFonts w:ascii="Calibri" w:hAnsi="Calibri"/>
+                <w:b w:val="0"/>
+                <w:color w:val="20262C"/>
+                <w:sz w:val="17"/>
+              </w:rPr>
+              <w:t>Classificação sem selo</w:t>
+            </w:r>
+          </w:p>
+        </w:tc>
+      </w:tr>
+    </w:tbl>
+    <w:tbl>
+      <w:tblPr>
+        <w:tblW w:type="dxa" w:w="9638"/>
+        <w:jc w:val="left"/>
+        <w:tblLayout w:type="fixed"/>
+        <w:tblLook w:firstColumn="1" w:firstRow="1" w:lastColumn="0" w:lastRow="0" w:noHBand="0" w:noVBand="1" w:val="04A0"/>
+        <w:tblInd w:w="120" w:type="dxa"/>
+      </w:tblPr>
+      <w:tblGrid>
+        <w:gridCol w:w="9638"/>
+      </w:tblGrid>
+      <w:tr>
+        <w:trPr>
+          <w:cantSplit/>
+        </w:trPr>
+        <w:tc>
+          <w:tcPr>
+            <w:tcW w:type="dxa" w:w="9638"/>
+            <w:tcMar>
+              <w:top w:w="80" w:type="dxa"/>
+              <w:start w:w="120" w:type="dxa"/>
+              <w:bottom w:w="80" w:type="dxa"/>
+              <w:end w:w="120" w:type="dxa"/>
+            </w:tcMar>
+            <w:shd w:fill="FFF7DD"/>
+            <w:tcBorders>
+              <w:left w:val="single" w:sz="18" w:color="8A6500"/>
+            </w:tcBorders>
+          </w:tcPr>
+          <w:p>
+            <w:pPr>
+              <w:spacing w:after="0"/>
+            </w:pPr>
+            <w:r>
+              <w:rPr>
+                <w:rFonts w:ascii="Calibri" w:hAnsi="Calibri"/>
+                <w:b/>
+                <w:color w:val="17324D"/>
+                <w:sz w:val="20"/>
+              </w:rPr>
+              <w:t xml:space="preserve">Natureza e limite deste documento. </w:t>
+            </w:r>
+            <w:r>
+              <w:rPr>
+                <w:rFonts w:ascii="Calibri" w:hAnsi="Calibri"/>
+                <w:color w:val="20262C"/>
+                <w:sz w:val="20"/>
+              </w:rPr>
+              <w:t>Este plano é uma contribuição cidadã baseada em fontes oficiais; não é parecer, auditoria ou avaliação emitida pela Atricon ou pelo TCE-MG. Os 83 itens do checklist derivam da matriz do PNTP. As recomendações específicas sobre publicidade institucional complementam a matriz com medidas de rastreabilidade apoiadas na Constituição, na LAI, na LRF, na LC nº 131/2009 e nas Leis nº 12.232/2010 e nº 14.133/2021.</w:t>
+            </w:r>
+          </w:p>
+        </w:tc>
+      </w:tr>
+    </w:tbl>
+    <w:p>
+      <w:pPr>
+        <w:spacing w:after="0" w:before="0"/>
+      </w:pPr>
+    </w:p>
+    <w:p>
+      <w:pPr>
+        <w:spacing w:before="40" w:after="0"/>
+      </w:pPr>
+      <w:r>
+        <w:rPr>
+          <w:rFonts w:ascii="Calibri" w:hAnsi="Calibri"/>
+          <w:b/>
+          <w:color w:val="17324D"/>
+          <w:sz w:val="18"/>
+        </w:rPr>
+        <w:t xml:space="preserve">Fontes institucionais: </w:t>
+      </w:r>
+      <w:hyperlink r:id="rId11">
+        <w:r>
+          <w:rPr>
+            <w:color w:val="1F5D8F"/>
+            <w:u w:val="single"/>
+            <w:sz w:val="20"/>
+          </w:rPr>
+          <w:t>PNTP/Atricon</w:t>
+        </w:r>
+      </w:hyperlink>
+      <w:r>
+        <w:rPr>
+          <w:rFonts w:ascii="Calibri" w:hAnsi="Calibri"/>
+          <w:color w:val="687581"/>
+          <w:sz w:val="18"/>
+        </w:rPr>
+        <w:t xml:space="preserve"> • </w:t>
+      </w:r>
+      <w:hyperlink r:id="rId12">
+        <w:r>
+          <w:rPr>
+            <w:color w:val="1F5D8F"/>
+            <w:u w:val="single"/>
+            <w:sz w:val="20"/>
+          </w:rPr>
+          <w:t>Matriz e materiais 2026</w:t>
+        </w:r>
+      </w:hyperlink>
+      <w:r>
+        <w:rPr>
+          <w:rFonts w:ascii="Calibri" w:hAnsi="Calibri"/>
+          <w:color w:val="687581"/>
+          <w:sz w:val="18"/>
+        </w:rPr>
+        <w:t xml:space="preserve"> • </w:t>
+      </w:r>
+      <w:hyperlink r:id="rId13">
+        <w:r>
+          <w:rPr>
+            <w:color w:val="1F5D8F"/>
+            <w:u w:val="single"/>
+            <w:sz w:val="20"/>
+          </w:rPr>
+          <w:t>FAQ PNTP do TCE-MG</w:t>
+        </w:r>
+      </w:hyperlink>
+    </w:p>
+    <w:p>
+      <w:r>
+        <w:br w:type="page"/>
+      </w:r>
     </w:p>
     <w:p>
       <w:pPr>
@@ -625,7 +1827,7 @@
                 <w:color w:val="20262C"/>
                 <w:sz w:val="20"/>
               </w:rPr>
-              <w:t>A matriz PNTP 2026 contém 83 critérios aplicáveis à Câmara: 7 essenciais, 60 obrigatórios e 16 recomendados. O Anexo A converte todos eles em ações e evidências de entrega, com prazo máximo de regularização até o 60º dia.</w:t>
+              <w:t>A matriz PNTP 2026 contém 83 critérios aplicáveis à Câmara: 7 essenciais, 60 obrigatórios e 16 recomendados. O Anexo A converte todos eles em ações e evidências de entrega, com prazo máximo de regularização até o 45º dia.</w:t>
             </w:r>
           </w:p>
         </w:tc>
@@ -671,7 +1873,7 @@
                 <w:color w:val="17324D"/>
                 <w:sz w:val="20"/>
               </w:rPr>
-              <w:t xml:space="preserve">Meta de 60 dias. </w:t>
+              <w:t xml:space="preserve">Meta de 45 dias. </w:t>
             </w:r>
             <w:r>
               <w:rPr>
@@ -2355,7 +3557,7 @@
                 <w:color w:val="20262C"/>
                 <w:sz w:val="16"/>
               </w:rPr>
-              <w:t>31-60 dias</w:t>
+              <w:t>24-38 dias</w:t>
             </w:r>
           </w:p>
         </w:tc>
@@ -2481,6 +3683,126 @@
                 <w:sz w:val="16"/>
               </w:rPr>
               <w:t>0-10 dias</w:t>
+            </w:r>
+          </w:p>
+        </w:tc>
+      </w:tr>
+      <w:tr>
+        <w:trPr>
+          <w:cantSplit/>
+        </w:trPr>
+        <w:tc>
+          <w:tcPr>
+            <w:tcW w:type="dxa" w:w="620"/>
+            <w:vAlign w:val="top"/>
+            <w:tcBorders>
+              <w:bottom w:val="single" w:sz="3" w:color="D8DEE3"/>
+            </w:tcBorders>
+          </w:tcPr>
+          <w:p>
+            <w:pPr>
+              <w:spacing w:after="0" w:line="240" w:lineRule="auto"/>
+            </w:pPr>
+            <w:r>
+              <w:rPr>
+                <w:rFonts w:ascii="Calibri" w:hAnsi="Calibri"/>
+                <w:b/>
+                <w:color w:val="1F5D8F"/>
+                <w:sz w:val="16"/>
+              </w:rPr>
+              <w:t>F-11</w:t>
+            </w:r>
+          </w:p>
+        </w:tc>
+        <w:tc>
+          <w:tcPr>
+            <w:tcW w:type="dxa" w:w="1500"/>
+            <w:vAlign w:val="top"/>
+            <w:tcBorders>
+              <w:bottom w:val="single" w:sz="3" w:color="D8DEE3"/>
+            </w:tcBorders>
+          </w:tcPr>
+          <w:p>
+            <w:pPr>
+              <w:spacing w:after="0" w:line="240" w:lineRule="auto"/>
+            </w:pPr>
+            <w:r>
+              <w:rPr>
+                <w:rFonts w:ascii="Calibri" w:hAnsi="Calibri"/>
+                <w:b w:val="0"/>
+                <w:color w:val="20262C"/>
+                <w:sz w:val="16"/>
+              </w:rPr>
+              <w:t>Deficiência observada</w:t>
+            </w:r>
+          </w:p>
+        </w:tc>
+        <w:tc>
+          <w:tcPr>
+            <w:tcW w:type="dxa" w:w="2580"/>
+            <w:vAlign w:val="top"/>
+            <w:tcBorders>
+              <w:bottom w:val="single" w:sz="3" w:color="D8DEE3"/>
+            </w:tcBorders>
+          </w:tcPr>
+          <w:p>
+            <w:pPr>
+              <w:spacing w:after="0" w:line="240" w:lineRule="auto"/>
+            </w:pPr>
+            <w:r>
+              <w:rPr>
+                <w:rFonts w:ascii="Calibri" w:hAnsi="Calibri"/>
+                <w:b w:val="0"/>
+                <w:color w:val="20262C"/>
+                <w:sz w:val="16"/>
+              </w:rPr>
+              <w:t>No Portal de Publicidade Institucional, os investimentos aparecem consolidados por tipo de mídia, sem trilha completa por campanha.</w:t>
+            </w:r>
+          </w:p>
+        </w:tc>
+        <w:tc>
+          <w:tcPr>
+            <w:tcW w:type="dxa" w:w="3938"/>
+            <w:vAlign w:val="top"/>
+            <w:tcBorders>
+              <w:bottom w:val="single" w:sz="3" w:color="D8DEE3"/>
+            </w:tcBorders>
+          </w:tcPr>
+          <w:p>
+            <w:pPr>
+              <w:spacing w:after="0" w:line="240" w:lineRule="auto"/>
+            </w:pPr>
+            <w:r>
+              <w:rPr>
+                <w:rFonts w:ascii="Calibri" w:hAnsi="Calibri"/>
+                <w:b w:val="0"/>
+                <w:color w:val="20262C"/>
+                <w:sz w:val="16"/>
+              </w:rPr>
+              <w:t>Ligar campanha, contrato, agência, fornecedor, veículo, peça, nota fiscal, empenho, liquidação e pagamento.</w:t>
+            </w:r>
+          </w:p>
+        </w:tc>
+        <w:tc>
+          <w:tcPr>
+            <w:tcW w:type="dxa" w:w="1000"/>
+            <w:vAlign w:val="top"/>
+            <w:tcBorders>
+              <w:bottom w:val="single" w:sz="3" w:color="D8DEE3"/>
+            </w:tcBorders>
+          </w:tcPr>
+          <w:p>
+            <w:pPr>
+              <w:spacing w:after="0" w:line="240" w:lineRule="auto"/>
+            </w:pPr>
+            <w:r>
+              <w:rPr>
+                <w:rFonts w:ascii="Calibri" w:hAnsi="Calibri"/>
+                <w:b w:val="0"/>
+                <w:color w:val="20262C"/>
+                <w:sz w:val="16"/>
+              </w:rPr>
+              <w:t>0-45 dias</w:t>
             </w:r>
           </w:p>
         </w:tc>
@@ -2550,7 +3872,7 @@
         <w:pStyle w:val="Heading1"/>
       </w:pPr>
       <w:r>
-        <w:t>4. Plano de regularização integral em 60 dias</w:t>
+        <w:t>4. Plano de regularização integral em 45 dias</w:t>
       </w:r>
     </w:p>
     <w:tbl>
@@ -2704,7 +4026,7 @@
                 <w:color w:val="1F5D8F"/>
                 <w:sz w:val="17"/>
               </w:rPr>
-              <w:t>Dias 1-10</w:t>
+              <w:t>Dias 1-7</w:t>
             </w:r>
           </w:p>
         </w:tc>
@@ -2802,7 +4124,7 @@
                 <w:color w:val="1F5D8F"/>
                 <w:sz w:val="17"/>
               </w:rPr>
-              <w:t>Dias 11-20</w:t>
+              <w:t>Dias 8-15</w:t>
             </w:r>
           </w:p>
         </w:tc>
@@ -2902,7 +4224,7 @@
                 <w:color w:val="1F5D8F"/>
                 <w:sz w:val="17"/>
               </w:rPr>
-              <w:t>Dias 21-30</w:t>
+              <w:t>Dias 16-23</w:t>
             </w:r>
           </w:p>
         </w:tc>
@@ -2948,7 +4270,7 @@
                 <w:color w:val="20262C"/>
                 <w:sz w:val="17"/>
               </w:rPr>
-              <w:t>Regularizar integralmente o passivo de publicações; completar pessoal, diárias, licitações, contratos, obras, prestação de contas e documentos administrativos.</w:t>
+              <w:t>Regularizar integralmente o passivo; completar pessoal, diárias, licitações, contratos, obras, publicidade institucional, prestação de contas e documentos administrativos.</w:t>
             </w:r>
           </w:p>
         </w:tc>
@@ -3000,7 +4322,7 @@
                 <w:color w:val="1F5D8F"/>
                 <w:sz w:val="17"/>
               </w:rPr>
-              <w:t>Dias 31-40</w:t>
+              <w:t>Dias 24-31</w:t>
             </w:r>
           </w:p>
         </w:tc>
@@ -3100,7 +4422,7 @@
                 <w:color w:val="1F5D8F"/>
                 <w:sz w:val="17"/>
               </w:rPr>
-              <w:t>Dias 41-50</w:t>
+              <w:t>Dias 32-38</w:t>
             </w:r>
           </w:p>
         </w:tc>
@@ -3198,7 +4520,7 @@
                 <w:color w:val="1F5D8F"/>
                 <w:sz w:val="17"/>
               </w:rPr>
-              <w:t>Dias 51-60</w:t>
+              <w:t>Dias 39-45</w:t>
             </w:r>
           </w:p>
         </w:tc>
@@ -3298,7 +4620,7 @@
                 <w:color w:val="1F5D8F"/>
                 <w:sz w:val="17"/>
               </w:rPr>
-              <w:t>Após o dia 60</w:t>
+              <w:t>Após o dia 45</w:t>
             </w:r>
           </w:p>
         </w:tc>
@@ -3421,7 +4743,7 @@
                 <w:color w:val="20262C"/>
                 <w:sz w:val="20"/>
               </w:rPr>
-              <w:t>Uma ação somente será considerada concluída quando houver publicação acessível, URL direta, conteúdo integral, data de atualização, responsável identificado e teste de funcionamento. Dependência de fornecedor deverá ter solução alternativa e não poderá manter a informação pública indisponível após o 60º dia.</w:t>
+              <w:t>Uma ação somente será considerada concluída quando houver publicação acessível, URL direta, conteúdo integral, data de atualização, responsável identificado e teste de funcionamento. Dependência de fornecedor deverá ter solução alternativa e não poderá manter a informação pública indisponível após o 45º dia.</w:t>
             </w:r>
           </w:p>
         </w:tc>
@@ -4211,7 +5533,7 @@
                 <w:color w:val="1F5D8F"/>
                 <w:sz w:val="18"/>
               </w:rPr>
-              <w:t>Participação cidadã</w:t>
+              <w:t>Publicidade institucional</w:t>
             </w:r>
           </w:p>
         </w:tc>
@@ -4235,12 +5557,983 @@
                 <w:color w:val="20262C"/>
                 <w:sz w:val="18"/>
               </w:rPr>
+              <w:t>Campanhas, contratos, agências, fornecedores, veículos, peças, notas fiscais, execução financeira e dados abertos.</w:t>
+            </w:r>
+          </w:p>
+        </w:tc>
+      </w:tr>
+      <w:tr>
+        <w:trPr>
+          <w:cantSplit/>
+        </w:trPr>
+        <w:tc>
+          <w:tcPr>
+            <w:tcW w:type="dxa" w:w="2550"/>
+            <w:vAlign w:val="top"/>
+            <w:tcBorders>
+              <w:bottom w:val="single" w:sz="3" w:color="D8DEE3"/>
+            </w:tcBorders>
+          </w:tcPr>
+          <w:p>
+            <w:pPr>
+              <w:spacing w:after="0" w:line="240" w:lineRule="auto"/>
+            </w:pPr>
+            <w:r>
+              <w:rPr>
+                <w:rFonts w:ascii="Calibri" w:hAnsi="Calibri"/>
+                <w:b/>
+                <w:color w:val="1F5D8F"/>
+                <w:sz w:val="18"/>
+              </w:rPr>
+              <w:t>Participação cidadã</w:t>
+            </w:r>
+          </w:p>
+        </w:tc>
+        <w:tc>
+          <w:tcPr>
+            <w:tcW w:type="dxa" w:w="7088"/>
+            <w:vAlign w:val="top"/>
+            <w:tcBorders>
+              <w:bottom w:val="single" w:sz="3" w:color="D8DEE3"/>
+            </w:tcBorders>
+          </w:tcPr>
+          <w:p>
+            <w:pPr>
+              <w:spacing w:after="0" w:line="240" w:lineRule="auto"/>
+            </w:pPr>
+            <w:r>
+              <w:rPr>
+                <w:rFonts w:ascii="Calibri" w:hAnsi="Calibri"/>
+                <w:b w:val="0"/>
+                <w:color w:val="20262C"/>
+                <w:sz w:val="18"/>
+              </w:rPr>
               <w:t>Consultas, audiências, pesquisa de satisfação, devolutiva e publicação das contribuições recebidas.</w:t>
             </w:r>
           </w:p>
         </w:tc>
       </w:tr>
     </w:tbl>
+    <w:p>
+      <w:pPr>
+        <w:pStyle w:val="Heading2"/>
+      </w:pPr>
+      <w:r>
+        <w:t>5.1 Publicidade institucional: detalhamento campanha a campanha</w:t>
+      </w:r>
+    </w:p>
+    <w:p>
+      <w:pPr>
+        <w:keepLines/>
+        <w:widowControl/>
+        <w:jc w:val="both"/>
+      </w:pPr>
+      <w:r>
+        <w:rPr>
+          <w:rFonts w:ascii="Calibri" w:hAnsi="Calibri"/>
+          <w:color w:val="20262C"/>
+          <w:sz w:val="21"/>
+        </w:rPr>
+        <w:t>A existência de um Portal de Publicidade Institucional específico representa avanço importante. Entretanto, a apresentação apenas de valores consolidados por modalidade de mídia - como Internet, Rádio, Jornal, Mídia Social e Produção - não permite acompanhar integralmente a origem, a execução e o resultado de cada despesa publicitária.</w:t>
+      </w:r>
+    </w:p>
+    <w:tbl>
+      <w:tblPr>
+        <w:tblW w:type="dxa" w:w="9638"/>
+        <w:jc w:val="left"/>
+        <w:tblLayout w:type="fixed"/>
+        <w:tblLook w:firstColumn="1" w:firstRow="1" w:lastColumn="0" w:lastRow="0" w:noHBand="0" w:noVBand="1" w:val="04A0"/>
+        <w:tblInd w:w="120" w:type="dxa"/>
+      </w:tblPr>
+      <w:tblGrid>
+        <w:gridCol w:w="9638"/>
+      </w:tblGrid>
+      <w:tr>
+        <w:trPr>
+          <w:cantSplit/>
+        </w:trPr>
+        <w:tc>
+          <w:tcPr>
+            <w:tcW w:type="dxa" w:w="9638"/>
+            <w:tcMar>
+              <w:top w:w="80" w:type="dxa"/>
+              <w:start w:w="120" w:type="dxa"/>
+              <w:bottom w:w="80" w:type="dxa"/>
+              <w:end w:w="120" w:type="dxa"/>
+            </w:tcMar>
+            <w:shd w:fill="FFF7DD"/>
+            <w:tcBorders>
+              <w:left w:val="single" w:sz="18" w:color="8A6500"/>
+            </w:tcBorders>
+          </w:tcPr>
+          <w:p>
+            <w:pPr>
+              <w:spacing w:after="0"/>
+            </w:pPr>
+            <w:r>
+              <w:rPr>
+                <w:rFonts w:ascii="Calibri" w:hAnsi="Calibri"/>
+                <w:b/>
+                <w:color w:val="17324D"/>
+                <w:sz w:val="20"/>
+              </w:rPr>
+              <w:t xml:space="preserve">Diagnóstico colaborativo. </w:t>
+            </w:r>
+            <w:r>
+              <w:rPr>
+                <w:rFonts w:ascii="Calibri" w:hAnsi="Calibri"/>
+                <w:color w:val="20262C"/>
+                <w:sz w:val="20"/>
+              </w:rPr>
+              <w:t>O cidadão deve conseguir partir do total informado e chegar à campanha que originou a despesa, ao contrato e à licitação, à agência ou fornecedor, aos veículos utilizados, às peças produzidas, às notas fiscais e aos valores empenhados, liquidados e pagos. A ausência desse detalhamento é uma barreira à conferência; por si só, não comprova irregularidade.</w:t>
+            </w:r>
+          </w:p>
+        </w:tc>
+      </w:tr>
+    </w:tbl>
+    <w:p>
+      <w:pPr>
+        <w:spacing w:after="0" w:before="0"/>
+      </w:pPr>
+    </w:p>
+    <w:tbl>
+      <w:tblPr>
+        <w:tblW w:type="dxa" w:w="9638"/>
+        <w:jc w:val="left"/>
+        <w:tblLayout w:type="fixed"/>
+        <w:tblLook w:firstColumn="1" w:firstRow="1" w:lastColumn="0" w:lastRow="0" w:noHBand="0" w:noVBand="1" w:val="04A0"/>
+        <w:tblInd w:w="120" w:type="dxa"/>
+      </w:tblPr>
+      <w:tblGrid>
+        <w:gridCol w:w="1800"/>
+        <w:gridCol w:w="4670"/>
+        <w:gridCol w:w="3168"/>
+      </w:tblGrid>
+      <w:tr>
+        <w:trPr>
+          <w:tblHeader w:val="true"/>
+          <w:cantSplit/>
+        </w:trPr>
+        <w:tc>
+          <w:tcPr>
+            <w:tcW w:type="dxa" w:w="1800"/>
+            <w:tcMar>
+              <w:top w:w="80" w:type="dxa"/>
+              <w:start w:w="120" w:type="dxa"/>
+              <w:bottom w:w="80" w:type="dxa"/>
+              <w:end w:w="120" w:type="dxa"/>
+            </w:tcMar>
+            <w:shd w:fill="17324D"/>
+            <w:vAlign w:val="center"/>
+          </w:tcPr>
+          <w:p>
+            <w:pPr>
+              <w:spacing w:after="0"/>
+            </w:pPr>
+            <w:r>
+              <w:rPr>
+                <w:rFonts w:ascii="Calibri" w:hAnsi="Calibri"/>
+                <w:b/>
+                <w:color w:val="FFFFFF"/>
+                <w:sz w:val="17"/>
+              </w:rPr>
+              <w:t>EIXO</w:t>
+            </w:r>
+          </w:p>
+        </w:tc>
+        <w:tc>
+          <w:tcPr>
+            <w:tcW w:type="dxa" w:w="4670"/>
+            <w:tcMar>
+              <w:top w:w="80" w:type="dxa"/>
+              <w:start w:w="120" w:type="dxa"/>
+              <w:bottom w:w="80" w:type="dxa"/>
+              <w:end w:w="120" w:type="dxa"/>
+            </w:tcMar>
+            <w:shd w:fill="17324D"/>
+            <w:vAlign w:val="center"/>
+          </w:tcPr>
+          <w:p>
+            <w:pPr>
+              <w:spacing w:after="0"/>
+            </w:pPr>
+            <w:r>
+              <w:rPr>
+                <w:rFonts w:ascii="Calibri" w:hAnsi="Calibri"/>
+                <w:b/>
+                <w:color w:val="FFFFFF"/>
+                <w:sz w:val="17"/>
+              </w:rPr>
+              <w:t>MELHORIA SUGERIDA</w:t>
+            </w:r>
+          </w:p>
+        </w:tc>
+        <w:tc>
+          <w:tcPr>
+            <w:tcW w:type="dxa" w:w="3168"/>
+            <w:tcMar>
+              <w:top w:w="80" w:type="dxa"/>
+              <w:start w:w="120" w:type="dxa"/>
+              <w:bottom w:w="80" w:type="dxa"/>
+              <w:end w:w="120" w:type="dxa"/>
+            </w:tcMar>
+            <w:shd w:fill="17324D"/>
+            <w:vAlign w:val="center"/>
+          </w:tcPr>
+          <w:p>
+            <w:pPr>
+              <w:spacing w:after="0"/>
+            </w:pPr>
+            <w:r>
+              <w:rPr>
+                <w:rFonts w:ascii="Calibri" w:hAnsi="Calibri"/>
+                <w:b/>
+                <w:color w:val="FFFFFF"/>
+                <w:sz w:val="17"/>
+              </w:rPr>
+              <w:t>EVIDÊNCIA DE ENTREGA</w:t>
+            </w:r>
+          </w:p>
+        </w:tc>
+      </w:tr>
+      <w:tr>
+        <w:trPr>
+          <w:cantSplit/>
+        </w:trPr>
+        <w:tc>
+          <w:tcPr>
+            <w:tcW w:type="dxa" w:w="1800"/>
+            <w:vAlign w:val="top"/>
+            <w:tcBorders>
+              <w:bottom w:val="single" w:sz="3" w:color="D8DEE3"/>
+            </w:tcBorders>
+          </w:tcPr>
+          <w:p>
+            <w:pPr>
+              <w:spacing w:after="0" w:line="240" w:lineRule="auto"/>
+            </w:pPr>
+            <w:r>
+              <w:rPr>
+                <w:rFonts w:ascii="Calibri" w:hAnsi="Calibri"/>
+                <w:b/>
+                <w:color w:val="1F5D8F"/>
+                <w:sz w:val="17"/>
+              </w:rPr>
+              <w:t>Painel geral</w:t>
+            </w:r>
+          </w:p>
+        </w:tc>
+        <w:tc>
+          <w:tcPr>
+            <w:tcW w:type="dxa" w:w="4670"/>
+            <w:vAlign w:val="top"/>
+            <w:tcBorders>
+              <w:bottom w:val="single" w:sz="3" w:color="D8DEE3"/>
+            </w:tcBorders>
+          </w:tcPr>
+          <w:p>
+            <w:pPr>
+              <w:spacing w:after="0" w:line="240" w:lineRule="auto"/>
+            </w:pPr>
+            <w:r>
+              <w:rPr>
+                <w:rFonts w:ascii="Calibri" w:hAnsi="Calibri"/>
+                <w:b w:val="0"/>
+                <w:color w:val="20262C"/>
+                <w:sz w:val="17"/>
+              </w:rPr>
+              <w:t>Indicadores por exercício, campanha, órgão demandante, modalidade de mídia e estágio de execução.</w:t>
+            </w:r>
+          </w:p>
+        </w:tc>
+        <w:tc>
+          <w:tcPr>
+            <w:tcW w:type="dxa" w:w="3168"/>
+            <w:vAlign w:val="top"/>
+            <w:tcBorders>
+              <w:bottom w:val="single" w:sz="3" w:color="D8DEE3"/>
+            </w:tcBorders>
+          </w:tcPr>
+          <w:p>
+            <w:pPr>
+              <w:spacing w:after="0" w:line="240" w:lineRule="auto"/>
+            </w:pPr>
+            <w:r>
+              <w:rPr>
+                <w:rFonts w:ascii="Calibri" w:hAnsi="Calibri"/>
+                <w:b w:val="0"/>
+                <w:color w:val="20262C"/>
+                <w:sz w:val="17"/>
+              </w:rPr>
+              <w:t>Totais conciliados, data de atualização, filtros e série histórica.</w:t>
+            </w:r>
+          </w:p>
+        </w:tc>
+      </w:tr>
+      <w:tr>
+        <w:trPr>
+          <w:cantSplit/>
+        </w:trPr>
+        <w:tc>
+          <w:tcPr>
+            <w:tcW w:type="dxa" w:w="1800"/>
+            <w:vAlign w:val="top"/>
+            <w:shd w:fill="F2F4F7"/>
+            <w:tcBorders>
+              <w:bottom w:val="single" w:sz="3" w:color="D8DEE3"/>
+            </w:tcBorders>
+          </w:tcPr>
+          <w:p>
+            <w:pPr>
+              <w:spacing w:after="0" w:line="240" w:lineRule="auto"/>
+            </w:pPr>
+            <w:r>
+              <w:rPr>
+                <w:rFonts w:ascii="Calibri" w:hAnsi="Calibri"/>
+                <w:b/>
+                <w:color w:val="1F5D8F"/>
+                <w:sz w:val="17"/>
+              </w:rPr>
+              <w:t>Página por campanha</w:t>
+            </w:r>
+          </w:p>
+        </w:tc>
+        <w:tc>
+          <w:tcPr>
+            <w:tcW w:type="dxa" w:w="4670"/>
+            <w:vAlign w:val="top"/>
+            <w:shd w:fill="F2F4F7"/>
+            <w:tcBorders>
+              <w:bottom w:val="single" w:sz="3" w:color="D8DEE3"/>
+            </w:tcBorders>
+          </w:tcPr>
+          <w:p>
+            <w:pPr>
+              <w:spacing w:after="0" w:line="240" w:lineRule="auto"/>
+            </w:pPr>
+            <w:r>
+              <w:rPr>
+                <w:rFonts w:ascii="Calibri" w:hAnsi="Calibri"/>
+                <w:b w:val="0"/>
+                <w:color w:val="20262C"/>
+                <w:sz w:val="17"/>
+              </w:rPr>
+              <w:t>Nome, objetivo público, período, público-alvo, unidade responsável e fundamentação legal.</w:t>
+            </w:r>
+          </w:p>
+        </w:tc>
+        <w:tc>
+          <w:tcPr>
+            <w:tcW w:type="dxa" w:w="3168"/>
+            <w:vAlign w:val="top"/>
+            <w:shd w:fill="F2F4F7"/>
+            <w:tcBorders>
+              <w:bottom w:val="single" w:sz="3" w:color="D8DEE3"/>
+            </w:tcBorders>
+          </w:tcPr>
+          <w:p>
+            <w:pPr>
+              <w:spacing w:after="0" w:line="240" w:lineRule="auto"/>
+            </w:pPr>
+            <w:r>
+              <w:rPr>
+                <w:rFonts w:ascii="Calibri" w:hAnsi="Calibri"/>
+                <w:b w:val="0"/>
+                <w:color w:val="20262C"/>
+                <w:sz w:val="17"/>
+              </w:rPr>
+              <w:t>URL permanente e ficha completa de cada campanha.</w:t>
+            </w:r>
+          </w:p>
+        </w:tc>
+      </w:tr>
+      <w:tr>
+        <w:trPr>
+          <w:cantSplit/>
+        </w:trPr>
+        <w:tc>
+          <w:tcPr>
+            <w:tcW w:type="dxa" w:w="1800"/>
+            <w:vAlign w:val="top"/>
+            <w:tcBorders>
+              <w:bottom w:val="single" w:sz="3" w:color="D8DEE3"/>
+            </w:tcBorders>
+          </w:tcPr>
+          <w:p>
+            <w:pPr>
+              <w:spacing w:after="0" w:line="240" w:lineRule="auto"/>
+            </w:pPr>
+            <w:r>
+              <w:rPr>
+                <w:rFonts w:ascii="Calibri" w:hAnsi="Calibri"/>
+                <w:b/>
+                <w:color w:val="1F5D8F"/>
+                <w:sz w:val="17"/>
+              </w:rPr>
+              <w:t>Execução financeira</w:t>
+            </w:r>
+          </w:p>
+        </w:tc>
+        <w:tc>
+          <w:tcPr>
+            <w:tcW w:type="dxa" w:w="4670"/>
+            <w:vAlign w:val="top"/>
+            <w:tcBorders>
+              <w:bottom w:val="single" w:sz="3" w:color="D8DEE3"/>
+            </w:tcBorders>
+          </w:tcPr>
+          <w:p>
+            <w:pPr>
+              <w:spacing w:after="0" w:line="240" w:lineRule="auto"/>
+            </w:pPr>
+            <w:r>
+              <w:rPr>
+                <w:rFonts w:ascii="Calibri" w:hAnsi="Calibri"/>
+                <w:b w:val="0"/>
+                <w:color w:val="20262C"/>
+                <w:sz w:val="17"/>
+              </w:rPr>
+              <w:t>Valores estimado, contratado, empenhado, liquidado e pago, com datas e saldos.</w:t>
+            </w:r>
+          </w:p>
+        </w:tc>
+        <w:tc>
+          <w:tcPr>
+            <w:tcW w:type="dxa" w:w="3168"/>
+            <w:vAlign w:val="top"/>
+            <w:tcBorders>
+              <w:bottom w:val="single" w:sz="3" w:color="D8DEE3"/>
+            </w:tcBorders>
+          </w:tcPr>
+          <w:p>
+            <w:pPr>
+              <w:spacing w:after="0" w:line="240" w:lineRule="auto"/>
+            </w:pPr>
+            <w:r>
+              <w:rPr>
+                <w:rFonts w:ascii="Calibri" w:hAnsi="Calibri"/>
+                <w:b w:val="0"/>
+                <w:color w:val="20262C"/>
+                <w:sz w:val="17"/>
+              </w:rPr>
+              <w:t>Vínculos diretos aos empenhos, liquidações e ordens de pagamento.</w:t>
+            </w:r>
+          </w:p>
+        </w:tc>
+      </w:tr>
+      <w:tr>
+        <w:trPr>
+          <w:cantSplit/>
+        </w:trPr>
+        <w:tc>
+          <w:tcPr>
+            <w:tcW w:type="dxa" w:w="1800"/>
+            <w:vAlign w:val="top"/>
+            <w:shd w:fill="F2F4F7"/>
+            <w:tcBorders>
+              <w:bottom w:val="single" w:sz="3" w:color="D8DEE3"/>
+            </w:tcBorders>
+          </w:tcPr>
+          <w:p>
+            <w:pPr>
+              <w:spacing w:after="0" w:line="240" w:lineRule="auto"/>
+            </w:pPr>
+            <w:r>
+              <w:rPr>
+                <w:rFonts w:ascii="Calibri" w:hAnsi="Calibri"/>
+                <w:b/>
+                <w:color w:val="1F5D8F"/>
+                <w:sz w:val="17"/>
+              </w:rPr>
+              <w:t>Fornecedores e veículos</w:t>
+            </w:r>
+          </w:p>
+        </w:tc>
+        <w:tc>
+          <w:tcPr>
+            <w:tcW w:type="dxa" w:w="4670"/>
+            <w:vAlign w:val="top"/>
+            <w:shd w:fill="F2F4F7"/>
+            <w:tcBorders>
+              <w:bottom w:val="single" w:sz="3" w:color="D8DEE3"/>
+            </w:tcBorders>
+          </w:tcPr>
+          <w:p>
+            <w:pPr>
+              <w:spacing w:after="0" w:line="240" w:lineRule="auto"/>
+            </w:pPr>
+            <w:r>
+              <w:rPr>
+                <w:rFonts w:ascii="Calibri" w:hAnsi="Calibri"/>
+                <w:b w:val="0"/>
+                <w:color w:val="20262C"/>
+                <w:sz w:val="17"/>
+              </w:rPr>
+              <w:t>Agência, fornecedores e veículos individualizados, com CNPJ, serviço, quantidade e valor.</w:t>
+            </w:r>
+          </w:p>
+        </w:tc>
+        <w:tc>
+          <w:tcPr>
+            <w:tcW w:type="dxa" w:w="3168"/>
+            <w:vAlign w:val="top"/>
+            <w:shd w:fill="F2F4F7"/>
+            <w:tcBorders>
+              <w:bottom w:val="single" w:sz="3" w:color="D8DEE3"/>
+            </w:tcBorders>
+          </w:tcPr>
+          <w:p>
+            <w:pPr>
+              <w:spacing w:after="0" w:line="240" w:lineRule="auto"/>
+            </w:pPr>
+            <w:r>
+              <w:rPr>
+                <w:rFonts w:ascii="Calibri" w:hAnsi="Calibri"/>
+                <w:b w:val="0"/>
+                <w:color w:val="20262C"/>
+                <w:sz w:val="17"/>
+              </w:rPr>
+              <w:t>Relação pesquisável, notas fiscais e valores recebidos por participante.</w:t>
+            </w:r>
+          </w:p>
+        </w:tc>
+      </w:tr>
+      <w:tr>
+        <w:trPr>
+          <w:cantSplit/>
+        </w:trPr>
+        <w:tc>
+          <w:tcPr>
+            <w:tcW w:type="dxa" w:w="1800"/>
+            <w:vAlign w:val="top"/>
+            <w:tcBorders>
+              <w:bottom w:val="single" w:sz="3" w:color="D8DEE3"/>
+            </w:tcBorders>
+          </w:tcPr>
+          <w:p>
+            <w:pPr>
+              <w:spacing w:after="0" w:line="240" w:lineRule="auto"/>
+            </w:pPr>
+            <w:r>
+              <w:rPr>
+                <w:rFonts w:ascii="Calibri" w:hAnsi="Calibri"/>
+                <w:b/>
+                <w:color w:val="1F5D8F"/>
+                <w:sz w:val="17"/>
+              </w:rPr>
+              <w:t>Documentos da contratação</w:t>
+            </w:r>
+          </w:p>
+        </w:tc>
+        <w:tc>
+          <w:tcPr>
+            <w:tcW w:type="dxa" w:w="4670"/>
+            <w:vAlign w:val="top"/>
+            <w:tcBorders>
+              <w:bottom w:val="single" w:sz="3" w:color="D8DEE3"/>
+            </w:tcBorders>
+          </w:tcPr>
+          <w:p>
+            <w:pPr>
+              <w:spacing w:after="0" w:line="240" w:lineRule="auto"/>
+            </w:pPr>
+            <w:r>
+              <w:rPr>
+                <w:rFonts w:ascii="Calibri" w:hAnsi="Calibri"/>
+                <w:b w:val="0"/>
+                <w:color w:val="20262C"/>
+                <w:sz w:val="17"/>
+              </w:rPr>
+              <w:t>Licitação, contrato, aditivos, ordens de serviço, planos de mídia, autorizações e comprovantes.</w:t>
+            </w:r>
+          </w:p>
+        </w:tc>
+        <w:tc>
+          <w:tcPr>
+            <w:tcW w:type="dxa" w:w="3168"/>
+            <w:vAlign w:val="top"/>
+            <w:tcBorders>
+              <w:bottom w:val="single" w:sz="3" w:color="D8DEE3"/>
+            </w:tcBorders>
+          </w:tcPr>
+          <w:p>
+            <w:pPr>
+              <w:spacing w:after="0" w:line="240" w:lineRule="auto"/>
+            </w:pPr>
+            <w:r>
+              <w:rPr>
+                <w:rFonts w:ascii="Calibri" w:hAnsi="Calibri"/>
+                <w:b w:val="0"/>
+                <w:color w:val="20262C"/>
+                <w:sz w:val="17"/>
+              </w:rPr>
+              <w:t>Inteiro teor dos documentos e vínculo com PNCP quando aplicável.</w:t>
+            </w:r>
+          </w:p>
+        </w:tc>
+      </w:tr>
+      <w:tr>
+        <w:trPr>
+          <w:cantSplit/>
+        </w:trPr>
+        <w:tc>
+          <w:tcPr>
+            <w:tcW w:type="dxa" w:w="1800"/>
+            <w:vAlign w:val="top"/>
+            <w:shd w:fill="F2F4F7"/>
+            <w:tcBorders>
+              <w:bottom w:val="single" w:sz="3" w:color="D8DEE3"/>
+            </w:tcBorders>
+          </w:tcPr>
+          <w:p>
+            <w:pPr>
+              <w:spacing w:after="0" w:line="240" w:lineRule="auto"/>
+            </w:pPr>
+            <w:r>
+              <w:rPr>
+                <w:rFonts w:ascii="Calibri" w:hAnsi="Calibri"/>
+                <w:b/>
+                <w:color w:val="1F5D8F"/>
+                <w:sz w:val="17"/>
+              </w:rPr>
+              <w:t>Peças publicitárias</w:t>
+            </w:r>
+          </w:p>
+        </w:tc>
+        <w:tc>
+          <w:tcPr>
+            <w:tcW w:type="dxa" w:w="4670"/>
+            <w:vAlign w:val="top"/>
+            <w:shd w:fill="F2F4F7"/>
+            <w:tcBorders>
+              <w:bottom w:val="single" w:sz="3" w:color="D8DEE3"/>
+            </w:tcBorders>
+          </w:tcPr>
+          <w:p>
+            <w:pPr>
+              <w:spacing w:after="0" w:line="240" w:lineRule="auto"/>
+            </w:pPr>
+            <w:r>
+              <w:rPr>
+                <w:rFonts w:ascii="Calibri" w:hAnsi="Calibri"/>
+                <w:b w:val="0"/>
+                <w:color w:val="20262C"/>
+                <w:sz w:val="17"/>
+              </w:rPr>
+              <w:t>Disponibilizar anúncios, vídeos, áudios, artes e demais materiais produzidos.</w:t>
+            </w:r>
+          </w:p>
+        </w:tc>
+        <w:tc>
+          <w:tcPr>
+            <w:tcW w:type="dxa" w:w="3168"/>
+            <w:vAlign w:val="top"/>
+            <w:shd w:fill="F2F4F7"/>
+            <w:tcBorders>
+              <w:bottom w:val="single" w:sz="3" w:color="D8DEE3"/>
+            </w:tcBorders>
+          </w:tcPr>
+          <w:p>
+            <w:pPr>
+              <w:spacing w:after="0" w:line="240" w:lineRule="auto"/>
+            </w:pPr>
+            <w:r>
+              <w:rPr>
+                <w:rFonts w:ascii="Calibri" w:hAnsi="Calibri"/>
+                <w:b w:val="0"/>
+                <w:color w:val="20262C"/>
+                <w:sz w:val="17"/>
+              </w:rPr>
+              <w:t>Arquivo ou link acessível, com campanha, data, formato e veículo.</w:t>
+            </w:r>
+          </w:p>
+        </w:tc>
+      </w:tr>
+      <w:tr>
+        <w:trPr>
+          <w:cantSplit/>
+        </w:trPr>
+        <w:tc>
+          <w:tcPr>
+            <w:tcW w:type="dxa" w:w="1800"/>
+            <w:vAlign w:val="top"/>
+            <w:tcBorders>
+              <w:bottom w:val="single" w:sz="3" w:color="D8DEE3"/>
+            </w:tcBorders>
+          </w:tcPr>
+          <w:p>
+            <w:pPr>
+              <w:spacing w:after="0" w:line="240" w:lineRule="auto"/>
+            </w:pPr>
+            <w:r>
+              <w:rPr>
+                <w:rFonts w:ascii="Calibri" w:hAnsi="Calibri"/>
+                <w:b/>
+                <w:color w:val="1F5D8F"/>
+                <w:sz w:val="17"/>
+              </w:rPr>
+              <w:t>Linha do tempo</w:t>
+            </w:r>
+          </w:p>
+        </w:tc>
+        <w:tc>
+          <w:tcPr>
+            <w:tcW w:type="dxa" w:w="4670"/>
+            <w:vAlign w:val="top"/>
+            <w:tcBorders>
+              <w:bottom w:val="single" w:sz="3" w:color="D8DEE3"/>
+            </w:tcBorders>
+          </w:tcPr>
+          <w:p>
+            <w:pPr>
+              <w:spacing w:after="0" w:line="240" w:lineRule="auto"/>
+            </w:pPr>
+            <w:r>
+              <w:rPr>
+                <w:rFonts w:ascii="Calibri" w:hAnsi="Calibri"/>
+                <w:b w:val="0"/>
+                <w:color w:val="20262C"/>
+                <w:sz w:val="17"/>
+              </w:rPr>
+              <w:t>Registrar planejamento, autorização, produção, veiculação, medição, faturamento e pagamento.</w:t>
+            </w:r>
+          </w:p>
+        </w:tc>
+        <w:tc>
+          <w:tcPr>
+            <w:tcW w:type="dxa" w:w="3168"/>
+            <w:vAlign w:val="top"/>
+            <w:tcBorders>
+              <w:bottom w:val="single" w:sz="3" w:color="D8DEE3"/>
+            </w:tcBorders>
+          </w:tcPr>
+          <w:p>
+            <w:pPr>
+              <w:spacing w:after="0" w:line="240" w:lineRule="auto"/>
+            </w:pPr>
+            <w:r>
+              <w:rPr>
+                <w:rFonts w:ascii="Calibri" w:hAnsi="Calibri"/>
+                <w:b w:val="0"/>
+                <w:color w:val="20262C"/>
+                <w:sz w:val="17"/>
+              </w:rPr>
+              <w:t>Situação atual e datas de cada marco da campanha.</w:t>
+            </w:r>
+          </w:p>
+        </w:tc>
+      </w:tr>
+      <w:tr>
+        <w:trPr>
+          <w:cantSplit/>
+        </w:trPr>
+        <w:tc>
+          <w:tcPr>
+            <w:tcW w:type="dxa" w:w="1800"/>
+            <w:vAlign w:val="top"/>
+            <w:shd w:fill="F2F4F7"/>
+            <w:tcBorders>
+              <w:bottom w:val="single" w:sz="3" w:color="D8DEE3"/>
+            </w:tcBorders>
+          </w:tcPr>
+          <w:p>
+            <w:pPr>
+              <w:spacing w:after="0" w:line="240" w:lineRule="auto"/>
+            </w:pPr>
+            <w:r>
+              <w:rPr>
+                <w:rFonts w:ascii="Calibri" w:hAnsi="Calibri"/>
+                <w:b/>
+                <w:color w:val="1F5D8F"/>
+                <w:sz w:val="17"/>
+              </w:rPr>
+              <w:t>Pesquisa e dados abertos</w:t>
+            </w:r>
+          </w:p>
+        </w:tc>
+        <w:tc>
+          <w:tcPr>
+            <w:tcW w:type="dxa" w:w="4670"/>
+            <w:vAlign w:val="top"/>
+            <w:shd w:fill="F2F4F7"/>
+            <w:tcBorders>
+              <w:bottom w:val="single" w:sz="3" w:color="D8DEE3"/>
+            </w:tcBorders>
+          </w:tcPr>
+          <w:p>
+            <w:pPr>
+              <w:spacing w:after="0" w:line="240" w:lineRule="auto"/>
+            </w:pPr>
+            <w:r>
+              <w:rPr>
+                <w:rFonts w:ascii="Calibri" w:hAnsi="Calibri"/>
+                <w:b w:val="0"/>
+                <w:color w:val="20262C"/>
+                <w:sz w:val="17"/>
+              </w:rPr>
+              <w:t>Busca por campanha, fornecedor, CNPJ, contrato, veículo, período e situação.</w:t>
+            </w:r>
+          </w:p>
+        </w:tc>
+        <w:tc>
+          <w:tcPr>
+            <w:tcW w:type="dxa" w:w="3168"/>
+            <w:vAlign w:val="top"/>
+            <w:shd w:fill="F2F4F7"/>
+            <w:tcBorders>
+              <w:bottom w:val="single" w:sz="3" w:color="D8DEE3"/>
+            </w:tcBorders>
+          </w:tcPr>
+          <w:p>
+            <w:pPr>
+              <w:spacing w:after="0" w:line="240" w:lineRule="auto"/>
+            </w:pPr>
+            <w:r>
+              <w:rPr>
+                <w:rFonts w:ascii="Calibri" w:hAnsi="Calibri"/>
+                <w:b w:val="0"/>
+                <w:color w:val="20262C"/>
+                <w:sz w:val="17"/>
+              </w:rPr>
+              <w:t>Exportação integral em CSV, XLSX e JSON, com dicionário e metadados.</w:t>
+            </w:r>
+          </w:p>
+        </w:tc>
+      </w:tr>
+      <w:tr>
+        <w:trPr>
+          <w:cantSplit/>
+        </w:trPr>
+        <w:tc>
+          <w:tcPr>
+            <w:tcW w:type="dxa" w:w="1800"/>
+            <w:vAlign w:val="top"/>
+            <w:tcBorders>
+              <w:bottom w:val="single" w:sz="3" w:color="D8DEE3"/>
+            </w:tcBorders>
+          </w:tcPr>
+          <w:p>
+            <w:pPr>
+              <w:spacing w:after="0" w:line="240" w:lineRule="auto"/>
+            </w:pPr>
+            <w:r>
+              <w:rPr>
+                <w:rFonts w:ascii="Calibri" w:hAnsi="Calibri"/>
+                <w:b/>
+                <w:color w:val="1F5D8F"/>
+                <w:sz w:val="17"/>
+              </w:rPr>
+              <w:t>Acessibilidade</w:t>
+            </w:r>
+          </w:p>
+        </w:tc>
+        <w:tc>
+          <w:tcPr>
+            <w:tcW w:type="dxa" w:w="4670"/>
+            <w:vAlign w:val="top"/>
+            <w:tcBorders>
+              <w:bottom w:val="single" w:sz="3" w:color="D8DEE3"/>
+            </w:tcBorders>
+          </w:tcPr>
+          <w:p>
+            <w:pPr>
+              <w:spacing w:after="0" w:line="240" w:lineRule="auto"/>
+            </w:pPr>
+            <w:r>
+              <w:rPr>
+                <w:rFonts w:ascii="Calibri" w:hAnsi="Calibri"/>
+                <w:b w:val="0"/>
+                <w:color w:val="20262C"/>
+                <w:sz w:val="17"/>
+              </w:rPr>
+              <w:t>Aplicar eMAG, navegação por teclado, contraste, audiodescrição, legendas e documentos pesquisáveis.</w:t>
+            </w:r>
+          </w:p>
+        </w:tc>
+        <w:tc>
+          <w:tcPr>
+            <w:tcW w:type="dxa" w:w="3168"/>
+            <w:vAlign w:val="top"/>
+            <w:tcBorders>
+              <w:bottom w:val="single" w:sz="3" w:color="D8DEE3"/>
+            </w:tcBorders>
+          </w:tcPr>
+          <w:p>
+            <w:pPr>
+              <w:spacing w:after="0" w:line="240" w:lineRule="auto"/>
+            </w:pPr>
+            <w:r>
+              <w:rPr>
+                <w:rFonts w:ascii="Calibri" w:hAnsi="Calibri"/>
+                <w:b w:val="0"/>
+                <w:color w:val="20262C"/>
+                <w:sz w:val="17"/>
+              </w:rPr>
+              <w:t>Testes registrados e alternativas acessíveis para cada tipo de peça.</w:t>
+            </w:r>
+          </w:p>
+        </w:tc>
+      </w:tr>
+    </w:tbl>
+    <w:tbl>
+      <w:tblPr>
+        <w:tblW w:type="dxa" w:w="9638"/>
+        <w:jc w:val="left"/>
+        <w:tblLayout w:type="fixed"/>
+        <w:tblLook w:firstColumn="1" w:firstRow="1" w:lastColumn="0" w:lastRow="0" w:noHBand="0" w:noVBand="1" w:val="04A0"/>
+        <w:tblInd w:w="120" w:type="dxa"/>
+      </w:tblPr>
+      <w:tblGrid>
+        <w:gridCol w:w="9638"/>
+      </w:tblGrid>
+      <w:tr>
+        <w:trPr>
+          <w:cantSplit/>
+        </w:trPr>
+        <w:tc>
+          <w:tcPr>
+            <w:tcW w:type="dxa" w:w="9638"/>
+            <w:tcMar>
+              <w:top w:w="80" w:type="dxa"/>
+              <w:start w:w="120" w:type="dxa"/>
+              <w:bottom w:w="80" w:type="dxa"/>
+              <w:end w:w="120" w:type="dxa"/>
+            </w:tcMar>
+            <w:shd w:fill="EAF5EF"/>
+            <w:tcBorders>
+              <w:left w:val="single" w:sz="18" w:color="297A5B"/>
+            </w:tcBorders>
+          </w:tcPr>
+          <w:p>
+            <w:pPr>
+              <w:spacing w:after="0"/>
+            </w:pPr>
+            <w:r>
+              <w:rPr>
+                <w:rFonts w:ascii="Calibri" w:hAnsi="Calibri"/>
+                <w:b/>
+                <w:color w:val="17324D"/>
+                <w:sz w:val="20"/>
+              </w:rPr>
+              <w:t xml:space="preserve">Fundamentação e benefícios. </w:t>
+            </w:r>
+            <w:r>
+              <w:rPr>
+                <w:rFonts w:ascii="Calibri" w:hAnsi="Calibri"/>
+                <w:color w:val="20262C"/>
+                <w:sz w:val="20"/>
+              </w:rPr>
+              <w:t>A proposta se apoia no art. 37 e no §1º da Constituição Federal, na LRF, na LC nº 131/2009, na LAI, na Lei nº 12.232/2010 e na Lei nº 14.133/2021. O detalhamento fortalece o controle social, facilita auditorias, reduz pedidos repetitivos de acesso à informação e amplia a confiança na publicidade institucional.</w:t>
+            </w:r>
+          </w:p>
+        </w:tc>
+      </w:tr>
+    </w:tbl>
+    <w:p>
+      <w:pPr>
+        <w:spacing w:after="0" w:before="0"/>
+      </w:pPr>
+    </w:p>
     <w:p>
       <w:pPr>
         <w:pStyle w:val="Heading1"/>
@@ -6204,7 +8497,7 @@
                 <w:color w:val="20262C"/>
                 <w:sz w:val="20"/>
               </w:rPr>
-              <w:t>Realizar uma reunião técnica inicial, seguida de devolutiva pública em até 30 dias. O Fiscaliza Varginha pode contribuir com testes de navegação, organização das evidências e comunicação em linguagem cidadã, respeitando a autonomia administrativa da Câmara.</w:t>
+              <w:t>Realizar uma reunião técnica inicial, seguida de devolutiva pública em até 30 dias. A sociedade civil poderá contribuir com testes de navegação, organização das evidências e sugestões em linguagem cidadã, respeitando a autonomia administrativa da Câmara.</w:t>
             </w:r>
           </w:p>
         </w:tc>
@@ -6749,7 +9042,7 @@
         </w:rPr>
         <w:t xml:space="preserve">1. </w:t>
       </w:r>
-      <w:hyperlink r:id="rId11">
+      <w:hyperlink r:id="rId14">
         <w:r>
           <w:rPr>
             <w:color w:val="1F5D8F"/>
@@ -6815,14 +9108,14 @@
         </w:rPr>
         <w:t xml:space="preserve">3. </w:t>
       </w:r>
-      <w:hyperlink r:id="rId13">
+      <w:hyperlink r:id="rId15">
         <w:r>
           <w:rPr>
             <w:color w:val="1F5D8F"/>
             <w:u w:val="single"/>
             <w:sz w:val="20"/>
           </w:rPr>
-          <w:t>Cartilha PNTP 2025 - Atricon</w:t>
+          <w:t>Cartilha PNTP 2026</w:t>
         </w:r>
       </w:hyperlink>
       <w:r>
@@ -6848,7 +9141,7 @@
         </w:rPr>
         <w:t xml:space="preserve">4. </w:t>
       </w:r>
-      <w:hyperlink r:id="rId14">
+      <w:hyperlink r:id="rId16">
         <w:r>
           <w:rPr>
             <w:color w:val="1F5D8F"/>
@@ -6881,7 +9174,7 @@
         </w:rPr>
         <w:t xml:space="preserve">5. </w:t>
       </w:r>
-      <w:hyperlink r:id="rId15">
+      <w:hyperlink r:id="rId17">
         <w:r>
           <w:rPr>
             <w:color w:val="1F5D8F"/>
@@ -6914,7 +9207,7 @@
         </w:rPr>
         <w:t xml:space="preserve">6. </w:t>
       </w:r>
-      <w:hyperlink r:id="rId16">
+      <w:hyperlink r:id="rId18">
         <w:r>
           <w:rPr>
             <w:color w:val="1F5D8F"/>
@@ -6947,7 +9240,7 @@
         </w:rPr>
         <w:t xml:space="preserve">7. </w:t>
       </w:r>
-      <w:hyperlink r:id="rId17">
+      <w:hyperlink r:id="rId19">
         <w:r>
           <w:rPr>
             <w:color w:val="1F5D8F"/>
@@ -6980,7 +9273,7 @@
         </w:rPr>
         <w:t xml:space="preserve">8. </w:t>
       </w:r>
-      <w:hyperlink r:id="rId18">
+      <w:hyperlink r:id="rId20">
         <w:r>
           <w:rPr>
             <w:color w:val="1F5D8F"/>
@@ -7013,7 +9306,7 @@
         </w:rPr>
         <w:t xml:space="preserve">9. </w:t>
       </w:r>
-      <w:hyperlink r:id="rId19">
+      <w:hyperlink r:id="rId21">
         <w:r>
           <w:rPr>
             <w:color w:val="1F5D8F"/>
@@ -7046,7 +9339,7 @@
         </w:rPr>
         <w:t xml:space="preserve">10. </w:t>
       </w:r>
-      <w:hyperlink r:id="rId20">
+      <w:hyperlink r:id="rId22">
         <w:r>
           <w:rPr>
             <w:color w:val="1F5D8F"/>
@@ -7079,7 +9372,7 @@
         </w:rPr>
         <w:t xml:space="preserve">11. </w:t>
       </w:r>
-      <w:hyperlink r:id="rId21">
+      <w:hyperlink r:id="rId23">
         <w:r>
           <w:rPr>
             <w:color w:val="1F5D8F"/>
@@ -7112,7 +9405,7 @@
         </w:rPr>
         <w:t xml:space="preserve">12. </w:t>
       </w:r>
-      <w:hyperlink r:id="rId22">
+      <w:hyperlink r:id="rId24">
         <w:r>
           <w:rPr>
             <w:color w:val="1F5D8F"/>
@@ -7129,6 +9422,105 @@
           <w:sz w:val="19"/>
         </w:rPr>
         <w:t xml:space="preserve"> - acessibilidade dos sítios governamentais.</w:t>
+      </w:r>
+    </w:p>
+    <w:p>
+      <w:pPr>
+        <w:spacing w:after="80"/>
+        <w:ind w:left="85" w:hanging="85"/>
+      </w:pPr>
+      <w:r>
+        <w:rPr>
+          <w:rFonts w:ascii="Calibri" w:hAnsi="Calibri"/>
+          <w:b/>
+          <w:color w:val="1F5D8F"/>
+          <w:sz w:val="19"/>
+        </w:rPr>
+        <w:t xml:space="preserve">13. </w:t>
+      </w:r>
+      <w:hyperlink r:id="rId25">
+        <w:r>
+          <w:rPr>
+            <w:color w:val="1F5D8F"/>
+            <w:u w:val="single"/>
+            <w:sz w:val="20"/>
+          </w:rPr>
+          <w:t>Constituição Federal, art. 37 e §1º</w:t>
+        </w:r>
+      </w:hyperlink>
+      <w:r>
+        <w:rPr>
+          <w:rFonts w:ascii="Calibri" w:hAnsi="Calibri"/>
+          <w:color w:val="20262C"/>
+          <w:sz w:val="19"/>
+        </w:rPr>
+        <w:t xml:space="preserve"> - princípios da administração e publicidade institucional.</w:t>
+      </w:r>
+    </w:p>
+    <w:p>
+      <w:pPr>
+        <w:spacing w:after="80"/>
+        <w:ind w:left="85" w:hanging="85"/>
+      </w:pPr>
+      <w:r>
+        <w:rPr>
+          <w:rFonts w:ascii="Calibri" w:hAnsi="Calibri"/>
+          <w:b/>
+          <w:color w:val="1F5D8F"/>
+          <w:sz w:val="19"/>
+        </w:rPr>
+        <w:t xml:space="preserve">14. </w:t>
+      </w:r>
+      <w:hyperlink r:id="rId26">
+        <w:r>
+          <w:rPr>
+            <w:color w:val="1F5D8F"/>
+            <w:u w:val="single"/>
+            <w:sz w:val="20"/>
+          </w:rPr>
+          <w:t>Lei Complementar nº 131/2009</w:t>
+        </w:r>
+      </w:hyperlink>
+      <w:r>
+        <w:rPr>
+          <w:rFonts w:ascii="Calibri" w:hAnsi="Calibri"/>
+          <w:color w:val="20262C"/>
+          <w:sz w:val="19"/>
+        </w:rPr>
+        <w:t xml:space="preserve"> - transparência da execução orçamentária e financeira.</w:t>
+      </w:r>
+    </w:p>
+    <w:p>
+      <w:pPr>
+        <w:spacing w:after="80"/>
+        <w:ind w:left="85" w:hanging="85"/>
+      </w:pPr>
+      <w:r>
+        <w:rPr>
+          <w:rFonts w:ascii="Calibri" w:hAnsi="Calibri"/>
+          <w:b/>
+          <w:color w:val="1F5D8F"/>
+          <w:sz w:val="19"/>
+        </w:rPr>
+        <w:t xml:space="preserve">15. </w:t>
+      </w:r>
+      <w:hyperlink r:id="rId27">
+        <w:r>
+          <w:rPr>
+            <w:color w:val="1F5D8F"/>
+            <w:u w:val="single"/>
+            <w:sz w:val="20"/>
+          </w:rPr>
+          <w:t>Lei nº 12.232/2010</w:t>
+        </w:r>
+      </w:hyperlink>
+      <w:r>
+        <w:rPr>
+          <w:rFonts w:ascii="Calibri" w:hAnsi="Calibri"/>
+          <w:color w:val="20262C"/>
+          <w:sz w:val="19"/>
+        </w:rPr>
+        <w:t xml:space="preserve"> - contratação de serviços de publicidade por agências.</w:t>
       </w:r>
     </w:p>
     <w:p>
@@ -7882,7 +10274,7 @@
           <w:color w:val="687581"/>
           <w:sz w:val="17"/>
         </w:rPr>
-        <w:t>Situação inicial sugerida: VALIDAR/REGULARIZAR - concluir até o 60º dia e registrar URL, data, responsável e evidência.</w:t>
+        <w:t>Situação inicial sugerida: VALIDAR/REGULARIZAR - concluir até o 45º dia e registrar URL, data, responsável e evidência.</w:t>
       </w:r>
     </w:p>
     <w:p>
@@ -9167,7 +11559,7 @@
           <w:color w:val="687581"/>
           <w:sz w:val="17"/>
         </w:rPr>
-        <w:t>Situação inicial sugerida: VALIDAR/REGULARIZAR - concluir até o 60º dia e registrar URL, data, responsável e evidência.</w:t>
+        <w:t>Situação inicial sugerida: VALIDAR/REGULARIZAR - concluir até o 45º dia e registrar URL, data, responsável e evidência.</w:t>
       </w:r>
     </w:p>
     <w:p>
@@ -9468,7 +11860,7 @@
           <w:color w:val="687581"/>
           <w:sz w:val="17"/>
         </w:rPr>
-        <w:t>Situação inicial sugerida: VALIDAR/REGULARIZAR - concluir até o 60º dia e registrar URL, data, responsável e evidência.</w:t>
+        <w:t>Situação inicial sugerida: VALIDAR/REGULARIZAR - concluir até o 45º dia e registrar URL, data, responsável e evidência.</w:t>
       </w:r>
     </w:p>
     <w:p>
@@ -10015,7 +12407,7 @@
           <w:color w:val="687581"/>
           <w:sz w:val="17"/>
         </w:rPr>
-        <w:t>Situação inicial sugerida: VALIDAR/REGULARIZAR - concluir até o 60º dia e registrar URL, data, responsável e evidência.</w:t>
+        <w:t>Situação inicial sugerida: VALIDAR/REGULARIZAR - concluir até o 45º dia e registrar URL, data, responsável e evidência.</w:t>
       </w:r>
     </w:p>
     <w:p>
@@ -10562,7 +12954,7 @@
           <w:color w:val="687581"/>
           <w:sz w:val="17"/>
         </w:rPr>
-        <w:t>Situação inicial sugerida: VALIDAR/REGULARIZAR - concluir até o 60º dia e registrar URL, data, responsável e evidência.</w:t>
+        <w:t>Situação inicial sugerida: VALIDAR/REGULARIZAR - concluir até o 45º dia e registrar URL, data, responsável e evidência.</w:t>
       </w:r>
     </w:p>
     <w:p>
@@ -11601,7 +13993,7 @@
           <w:color w:val="687581"/>
           <w:sz w:val="17"/>
         </w:rPr>
-        <w:t>Situação inicial sugerida: VALIDAR/REGULARIZAR - concluir até o 60º dia e registrar URL, data, responsável e evidência.</w:t>
+        <w:t>Situação inicial sugerida: VALIDAR/REGULARIZAR - concluir até o 45º dia e registrar URL, data, responsável e evidência.</w:t>
       </w:r>
     </w:p>
     <w:p>
@@ -12027,7 +14419,7 @@
           <w:color w:val="687581"/>
           <w:sz w:val="17"/>
         </w:rPr>
-        <w:t>Situação inicial sugerida: VALIDAR/REGULARIZAR - concluir até o 60º dia e registrar URL, data, responsável e evidência.</w:t>
+        <w:t>Situação inicial sugerida: VALIDAR/REGULARIZAR - concluir até o 45º dia e registrar URL, data, responsável e evidência.</w:t>
       </w:r>
     </w:p>
     <w:p>
@@ -13066,7 +15458,7 @@
           <w:color w:val="687581"/>
           <w:sz w:val="17"/>
         </w:rPr>
-        <w:t>Situação inicial sugerida: VALIDAR/REGULARIZAR - concluir até o 60º dia e registrar URL, data, responsável e evidência.</w:t>
+        <w:t>Situação inicial sugerida: VALIDAR/REGULARIZAR - concluir até o 45º dia e registrar URL, data, responsável e evidência.</w:t>
       </w:r>
     </w:p>
     <w:p>
@@ -13738,7 +16130,7 @@
           <w:color w:val="687581"/>
           <w:sz w:val="17"/>
         </w:rPr>
-        <w:t>Situação inicial sugerida: VALIDAR/REGULARIZAR - concluir até o 60º dia e registrar URL, data, responsável e evidência.</w:t>
+        <w:t>Situação inicial sugerida: VALIDAR/REGULARIZAR - concluir até o 45º dia e registrar URL, data, responsável e evidência.</w:t>
       </w:r>
     </w:p>
     <w:p>
@@ -14410,7 +16802,7 @@
           <w:color w:val="687581"/>
           <w:sz w:val="17"/>
         </w:rPr>
-        <w:t>Situação inicial sugerida: VALIDAR/REGULARIZAR - concluir até o 60º dia e registrar URL, data, responsável e evidência.</w:t>
+        <w:t>Situação inicial sugerida: VALIDAR/REGULARIZAR - concluir até o 45º dia e registrar URL, data, responsável e evidência.</w:t>
       </w:r>
     </w:p>
     <w:p>
@@ -15203,7 +17595,7 @@
           <w:color w:val="687581"/>
           <w:sz w:val="17"/>
         </w:rPr>
-        <w:t>Situação inicial sugerida: VALIDAR/REGULARIZAR - concluir até o 60º dia e registrar URL, data, responsável e evidência.</w:t>
+        <w:t>Situação inicial sugerida: VALIDAR/REGULARIZAR - concluir até o 45º dia e registrar URL, data, responsável e evidência.</w:t>
       </w:r>
     </w:p>
     <w:p>
@@ -16488,7 +18880,7 @@
           <w:color w:val="687581"/>
           <w:sz w:val="17"/>
         </w:rPr>
-        <w:t>Situação inicial sugerida: VALIDAR/REGULARIZAR - concluir até o 60º dia e registrar URL, data, responsável e evidência.</w:t>
+        <w:t>Situação inicial sugerida: VALIDAR/REGULARIZAR - concluir até o 45º dia e registrar URL, data, responsável e evidência.</w:t>
       </w:r>
     </w:p>
     <w:p>
@@ -17281,7 +19673,7 @@
           <w:color w:val="687581"/>
           <w:sz w:val="17"/>
         </w:rPr>
-        <w:t>Situação inicial sugerida: VALIDAR/REGULARIZAR - concluir até o 60º dia e registrar URL, data, responsável e evidência.</w:t>
+        <w:t>Situação inicial sugerida: VALIDAR/REGULARIZAR - concluir até o 45º dia e registrar URL, data, responsável e evidência.</w:t>
       </w:r>
     </w:p>
     <w:p>
@@ -17828,7 +20220,7 @@
           <w:color w:val="687581"/>
           <w:sz w:val="17"/>
         </w:rPr>
-        <w:t>Situação inicial sugerida: VALIDAR/REGULARIZAR - concluir até o 60º dia e registrar URL, data, responsável e evidência.</w:t>
+        <w:t>Situação inicial sugerida: VALIDAR/REGULARIZAR - concluir até o 45º dia e registrar URL, data, responsável e evidência.</w:t>
       </w:r>
     </w:p>
     <w:p>
@@ -18746,7 +21138,7 @@
           <w:color w:val="687581"/>
           <w:sz w:val="17"/>
         </w:rPr>
-        <w:t>Situação inicial sugerida: VALIDAR/REGULARIZAR - concluir até o 60º dia e registrar URL, data, responsável e evidência.</w:t>
+        <w:t>Situação inicial sugerida: VALIDAR/REGULARIZAR - concluir até o 45º dia e registrar URL, data, responsável e evidência.</w:t>
       </w:r>
     </w:p>
     <w:p>
@@ -20277,7 +22669,7 @@
           <w:color w:val="687581"/>
           <w:sz w:val="17"/>
         </w:rPr>
-        <w:t>Situação inicial sugerida: VALIDAR/REGULARIZAR - concluir até o 60º dia e registrar URL, data, responsável e evidência.</w:t>
+        <w:t>Situação inicial sugerida: VALIDAR/REGULARIZAR - concluir até o 45º dia e registrar URL, data, responsável e evidência.</w:t>
       </w:r>
     </w:p>
     <w:p>
@@ -20300,7 +22692,7 @@
           <w:color w:val="20262C"/>
           <w:sz w:val="21"/>
         </w:rPr>
-        <w:t>Sugere-se que este plano seja recebido como contribuição técnica e cidadã, submetido aos setores responsáveis e executado em até 60 dias, com indicação dos itens já atendidos, das correções aceitas, dos responsáveis e das datas de conclusão. A publicação da própria resposta e do cronograma reforçará a confiança, facilitará o controle interno e permitirá que a sociedade acompanhe os avanços de forma construtiva.</w:t>
+        <w:t>Sugere-se que este plano seja recebido como contribuição técnica e cidadã, submetido aos setores responsáveis e executado em até 45 dias, com indicação dos itens já atendidos, das correções aceitas, dos responsáveis e das datas de conclusão. A publicação da própria resposta e do cronograma reforçará a confiança, facilitará o controle interno e permitirá que a sociedade acompanhe os avanços de forma construtiva.</w:t>
       </w:r>
     </w:p>
     <w:tbl>
@@ -20370,7 +22762,7 @@
           <w:color w:val="17324D"/>
           <w:sz w:val="22"/>
         </w:rPr>
-        <w:t>FISCALIZA VARGINHA</w:t>
+        <w:t>GLEISON KLEBER DOS SANTOS</w:t>
       </w:r>
       <w:r>
         <w:rPr>
@@ -20379,7 +22771,7 @@
           <w:sz w:val="19"/>
         </w:rPr>
         <w:br/>
-        <w:t>Iniciativa cidadã independente e apartidária</w:t>
+        <w:t>Contribuição cidadã independente e apartidária</w:t>
       </w:r>
     </w:p>
     <w:sectPr>
@@ -20468,7 +22860,7 @@
               <w:color w:val="FFFFFF"/>
               <w:sz w:val="18"/>
             </w:rPr>
-            <w:t>FISCALIZA VARGINHA</w:t>
+            <w:t>CONTRIBUIÇÃO CIDADÃ</w:t>
           </w:r>
         </w:p>
       </w:tc>

</xml_diff>